<commit_message>
Simplify design document for team sync and explain safety plans
</commit_message>
<xml_diff>
--- a/output/documents/SensoSpoon_Conceptual_and_Detailed_Design.docx
+++ b/output/documents/SensoSpoon_Conceptual_and_Detailed_Design.docx
@@ -7,7 +7,7 @@
         <w:pStyle w:val="Title"/>
       </w:pPr>
       <w:r>
-        <w:t>SensoSpoon Design</w:t>
+        <w:t>SensoSpoon Design Update</w:t>
       </w:r>
     </w:p>
     <w:p>
@@ -15,642 +15,12 @@
         <w:pStyle w:val="Subtitle"/>
       </w:pPr>
       <w:r>
-        <w:t>Conceptual Design and Detailed Design</w:t>
-      </w:r>
-    </w:p>
-    <w:p>
-      <w:pPr>
-        <w:pStyle w:val="Subtitle"/>
-      </w:pPr>
-      <w:r>
-        <w:t>MECHENG736/730  |  September 2026</w:t>
+        <w:t>Team sync  |  14 September 2026</w:t>
       </w:r>
     </w:p>
     <w:p>
       <w:r>
-        <w:t>SensoSpoon is an actively stabilised eating utensil designed to reduce unwanted spoon motion while preserving the user’s intended movement. The selected design combines a two-axis flexure gimbal, two handle-mounted voice-coil actuators, dual inertial sensors and optional surface electromyography (sEMG) assistance. This document explains the design choices, their implementation and the evidence needed before a physical prototype can be considered reliable.</w:t>
-      </w:r>
-    </w:p>
-    <w:p>
-      <w:pPr>
-        <w:pStyle w:val="Heading1"/>
-      </w:pPr>
-      <w:r>
-        <w:t>1 Conceptual Design</w:t>
-      </w:r>
-    </w:p>
-    <w:p>
-      <w:pPr>
-        <w:pStyle w:val="Heading2"/>
-      </w:pPr>
-      <w:r>
-        <w:t>Design objective and scope</w:t>
-      </w:r>
-    </w:p>
-    <w:p>
-      <w:r>
-        <w:t>The user should be able to lift and orient the spoon naturally without the controller treating every movement as a disturbance. The main engineering challenge is to separate intended movement from tremor, then produce corrective torque with limited actuator force and travel. Pitch raises or lowers the spoon tip; roll tilts the bowl from side to side.</w:t>
-      </w:r>
-    </w:p>
-    <w:p>
-      <w:r>
-        <w:t>The selected scope is active pitch and roll compensation over a defined operating envelope. Two controlled rotations cannot cancel arbitrary three-dimensional translation and rotation simultaneously. Near-zero spillage is a useful task outcome, but it does not imply zero motion or universal tremor cancellation.</w:t>
-      </w:r>
-    </w:p>
-    <w:tbl>
-      <w:tblPr>
-        <w:tblW w:type="auto" w:w="0"/>
-        <w:jc w:val="center"/>
-        <w:tblLayout w:type="fixed"/>
-        <w:tblLook w:firstColumn="1" w:firstRow="1" w:lastColumn="0" w:lastRow="0" w:noHBand="0" w:noVBand="1" w:val="04A0"/>
-        <w:tblBorders>
-          <w:top w:val="single" w:sz="4" w:color="D9D9D9"/>
-          <w:left w:val="single" w:sz="4" w:color="D9D9D9"/>
-          <w:bottom w:val="single" w:sz="4" w:color="D9D9D9"/>
-          <w:right w:val="single" w:sz="4" w:color="D9D9D9"/>
-          <w:insideH w:val="single" w:sz="4" w:color="D9D9D9"/>
-          <w:insideV w:val="single" w:sz="4" w:color="D9D9D9"/>
-        </w:tblBorders>
-      </w:tblPr>
-      <w:tblGrid>
-        <w:gridCol w:w="2232"/>
-        <w:gridCol w:w="7344"/>
-      </w:tblGrid>
-      <w:tr>
-        <w:trPr>
-          <w:cantSplit/>
-          <w:tblHeader/>
-        </w:trPr>
-        <w:tc>
-          <w:tcPr>
-            <w:tcW w:type="dxa" w:w="2232"/>
-            <w:vAlign w:val="center"/>
-            <w:tcMar>
-              <w:top w:w="85" w:type="dxa"/>
-              <w:left w:w="85" w:type="dxa"/>
-              <w:bottom w:w="85" w:type="dxa"/>
-              <w:right w:w="85" w:type="dxa"/>
-            </w:tcMar>
-            <w:shd w:fill="343A40"/>
-          </w:tcPr>
-          <w:p>
-            <w:pPr>
-              <w:spacing w:after="20" w:line="247" w:lineRule="auto"/>
-            </w:pPr>
-            <w:r>
-              <w:rPr>
-                <w:b/>
-                <w:color w:val="FFFFFF"/>
-                <w:sz w:val="19"/>
-              </w:rPr>
-              <w:t>Design criterion</w:t>
-            </w:r>
-          </w:p>
-        </w:tc>
-        <w:tc>
-          <w:tcPr>
-            <w:tcW w:type="dxa" w:w="7344"/>
-            <w:vAlign w:val="center"/>
-            <w:tcMar>
-              <w:top w:w="85" w:type="dxa"/>
-              <w:left w:w="85" w:type="dxa"/>
-              <w:bottom w:w="85" w:type="dxa"/>
-              <w:right w:w="85" w:type="dxa"/>
-            </w:tcMar>
-            <w:shd w:fill="343A40"/>
-          </w:tcPr>
-          <w:p>
-            <w:pPr>
-              <w:spacing w:after="20" w:line="247" w:lineRule="auto"/>
-            </w:pPr>
-            <w:r>
-              <w:rPr>
-                <w:b/>
-                <w:color w:val="FFFFFF"/>
-                <w:sz w:val="19"/>
-              </w:rPr>
-              <w:t>Working specification or evaluation</w:t>
-            </w:r>
-          </w:p>
-        </w:tc>
-      </w:tr>
-      <w:tr>
-        <w:trPr>
-          <w:cantSplit/>
-        </w:trPr>
-        <w:tc>
-          <w:tcPr>
-            <w:tcW w:type="dxa" w:w="2232"/>
-            <w:vAlign w:val="center"/>
-            <w:tcMar>
-              <w:top w:w="85" w:type="dxa"/>
-              <w:left w:w="85" w:type="dxa"/>
-              <w:bottom w:w="85" w:type="dxa"/>
-              <w:right w:w="85" w:type="dxa"/>
-            </w:tcMar>
-            <w:shd w:fill="FFFFFF"/>
-          </w:tcPr>
-          <w:p>
-            <w:pPr>
-              <w:spacing w:after="20" w:line="247" w:lineRule="auto"/>
-            </w:pPr>
-            <w:r>
-              <w:rPr>
-                <w:b w:val="0"/>
-                <w:color w:val="000000"/>
-                <w:sz w:val="19"/>
-              </w:rPr>
-              <w:t>Disturbance rejection</w:t>
-            </w:r>
-          </w:p>
-        </w:tc>
-        <w:tc>
-          <w:tcPr>
-            <w:tcW w:type="dxa" w:w="7344"/>
-            <w:vAlign w:val="center"/>
-            <w:tcMar>
-              <w:top w:w="85" w:type="dxa"/>
-              <w:left w:w="85" w:type="dxa"/>
-              <w:bottom w:w="85" w:type="dxa"/>
-              <w:right w:w="85" w:type="dxa"/>
-            </w:tcMar>
-            <w:shd w:fill="FFFFFF"/>
-          </w:tcPr>
-          <w:p>
-            <w:pPr>
-              <w:spacing w:after="20" w:line="247" w:lineRule="auto"/>
-            </w:pPr>
-            <w:r>
-              <w:rPr>
-                <w:b w:val="0"/>
-                <w:color w:val="000000"/>
-                <w:sz w:val="19"/>
-              </w:rPr>
-              <w:t>Assess 4–12 Hz rotational inputs; target at least 90% attitude RMS reduction in nominal 1° per-axis tests.</w:t>
-            </w:r>
-          </w:p>
-        </w:tc>
-      </w:tr>
-      <w:tr>
-        <w:trPr>
-          <w:cantSplit/>
-        </w:trPr>
-        <w:tc>
-          <w:tcPr>
-            <w:tcW w:type="dxa" w:w="2232"/>
-            <w:vAlign w:val="center"/>
-            <w:tcMar>
-              <w:top w:w="85" w:type="dxa"/>
-              <w:left w:w="85" w:type="dxa"/>
-              <w:bottom w:w="85" w:type="dxa"/>
-              <w:right w:w="85" w:type="dxa"/>
-            </w:tcMar>
-            <w:shd w:fill="F2F4F6"/>
-          </w:tcPr>
-          <w:p>
-            <w:pPr>
-              <w:spacing w:after="20" w:line="247" w:lineRule="auto"/>
-            </w:pPr>
-            <w:r>
-              <w:rPr>
-                <w:b w:val="0"/>
-                <w:color w:val="000000"/>
-                <w:sz w:val="19"/>
-              </w:rPr>
-              <w:t>User control</w:t>
-            </w:r>
-          </w:p>
-        </w:tc>
-        <w:tc>
-          <w:tcPr>
-            <w:tcW w:type="dxa" w:w="7344"/>
-            <w:vAlign w:val="center"/>
-            <w:tcMar>
-              <w:top w:w="85" w:type="dxa"/>
-              <w:left w:w="85" w:type="dxa"/>
-              <w:bottom w:w="85" w:type="dxa"/>
-              <w:right w:w="85" w:type="dxa"/>
-            </w:tcMar>
-            <w:shd w:fill="F2F4F6"/>
-          </w:tcPr>
-          <w:p>
-            <w:pPr>
-              <w:spacing w:after="20" w:line="247" w:lineRule="auto"/>
-            </w:pPr>
-            <w:r>
-              <w:rPr>
-                <w:b w:val="0"/>
-                <w:color w:val="000000"/>
-                <w:sz w:val="19"/>
-              </w:rPr>
-              <w:t>Preserve voluntary movement; report tracking error separately from tremor-only performance.</w:t>
-            </w:r>
-          </w:p>
-        </w:tc>
-      </w:tr>
-      <w:tr>
-        <w:trPr>
-          <w:cantSplit/>
-        </w:trPr>
-        <w:tc>
-          <w:tcPr>
-            <w:tcW w:type="dxa" w:w="2232"/>
-            <w:vAlign w:val="center"/>
-            <w:tcMar>
-              <w:top w:w="85" w:type="dxa"/>
-              <w:left w:w="85" w:type="dxa"/>
-              <w:bottom w:w="85" w:type="dxa"/>
-              <w:right w:w="85" w:type="dxa"/>
-            </w:tcMar>
-            <w:shd w:fill="FFFFFF"/>
-          </w:tcPr>
-          <w:p>
-            <w:pPr>
-              <w:spacing w:after="20" w:line="247" w:lineRule="auto"/>
-            </w:pPr>
-            <w:r>
-              <w:rPr>
-                <w:b w:val="0"/>
-                <w:color w:val="000000"/>
-                <w:sz w:val="19"/>
-              </w:rPr>
-              <w:t>Mechanical authority</w:t>
-            </w:r>
-          </w:p>
-        </w:tc>
-        <w:tc>
-          <w:tcPr>
-            <w:tcW w:type="dxa" w:w="7344"/>
-            <w:vAlign w:val="center"/>
-            <w:tcMar>
-              <w:top w:w="85" w:type="dxa"/>
-              <w:left w:w="85" w:type="dxa"/>
-              <w:bottom w:w="85" w:type="dxa"/>
-              <w:right w:w="85" w:type="dxa"/>
-            </w:tcMar>
-            <w:shd w:fill="FFFFFF"/>
-          </w:tcPr>
-          <w:p>
-            <w:pPr>
-              <w:spacing w:after="20" w:line="247" w:lineRule="auto"/>
-            </w:pPr>
-            <w:r>
-              <w:rPr>
-                <w:b w:val="0"/>
-                <w:color w:val="000000"/>
-                <w:sz w:val="19"/>
-              </w:rPr>
-              <w:t>Command within ±14° per axis; model compliant stops at ±15° and actuator stroke of ±6.35 mm.</w:t>
-            </w:r>
-          </w:p>
-        </w:tc>
-      </w:tr>
-      <w:tr>
-        <w:trPr>
-          <w:cantSplit/>
-        </w:trPr>
-        <w:tc>
-          <w:tcPr>
-            <w:tcW w:type="dxa" w:w="2232"/>
-            <w:vAlign w:val="center"/>
-            <w:tcMar>
-              <w:top w:w="85" w:type="dxa"/>
-              <w:left w:w="85" w:type="dxa"/>
-              <w:bottom w:w="85" w:type="dxa"/>
-              <w:right w:w="85" w:type="dxa"/>
-            </w:tcMar>
-            <w:shd w:fill="F2F4F6"/>
-          </w:tcPr>
-          <w:p>
-            <w:pPr>
-              <w:spacing w:after="20" w:line="247" w:lineRule="auto"/>
-            </w:pPr>
-            <w:r>
-              <w:rPr>
-                <w:b w:val="0"/>
-                <w:color w:val="000000"/>
-                <w:sz w:val="19"/>
-              </w:rPr>
-              <w:t>Practical use</w:t>
-            </w:r>
-          </w:p>
-        </w:tc>
-        <w:tc>
-          <w:tcPr>
-            <w:tcW w:type="dxa" w:w="7344"/>
-            <w:vAlign w:val="center"/>
-            <w:tcMar>
-              <w:top w:w="85" w:type="dxa"/>
-              <w:left w:w="85" w:type="dxa"/>
-              <w:bottom w:w="85" w:type="dxa"/>
-              <w:right w:w="85" w:type="dxa"/>
-            </w:tcMar>
-            <w:shd w:fill="F2F4F6"/>
-          </w:tcPr>
-          <w:p>
-            <w:pPr>
-              <w:spacing w:after="20" w:line="247" w:lineRule="auto"/>
-            </w:pPr>
-            <w:r>
-              <w:rPr>
-                <w:b w:val="0"/>
-                <w:color w:val="000000"/>
-                <w:sz w:val="19"/>
-              </w:rPr>
-              <w:t>Detachable spoon, rounded grip and protected electronics; cleaning and comfort require physical testing.</w:t>
-            </w:r>
-          </w:p>
-        </w:tc>
-      </w:tr>
-    </w:tbl>
-    <w:p/>
-    <w:p>
-      <w:pPr>
-        <w:pStyle w:val="Heading2"/>
-      </w:pPr>
-      <w:r>
-        <w:t>Concept selection</w:t>
-      </w:r>
-    </w:p>
-    <w:tbl>
-      <w:tblPr>
-        <w:tblW w:type="auto" w:w="0"/>
-        <w:jc w:val="center"/>
-        <w:tblLayout w:type="fixed"/>
-        <w:tblLook w:firstColumn="1" w:firstRow="1" w:lastColumn="0" w:lastRow="0" w:noHBand="0" w:noVBand="1" w:val="04A0"/>
-        <w:tblBorders>
-          <w:top w:val="single" w:sz="4" w:color="D9D9D9"/>
-          <w:left w:val="single" w:sz="4" w:color="D9D9D9"/>
-          <w:bottom w:val="single" w:sz="4" w:color="D9D9D9"/>
-          <w:right w:val="single" w:sz="4" w:color="D9D9D9"/>
-          <w:insideH w:val="single" w:sz="4" w:color="D9D9D9"/>
-          <w:insideV w:val="single" w:sz="4" w:color="D9D9D9"/>
-        </w:tblBorders>
-      </w:tblPr>
-      <w:tblGrid>
-        <w:gridCol w:w="2808"/>
-        <w:gridCol w:w="6768"/>
-      </w:tblGrid>
-      <w:tr>
-        <w:trPr>
-          <w:cantSplit/>
-          <w:tblHeader/>
-        </w:trPr>
-        <w:tc>
-          <w:tcPr>
-            <w:tcW w:type="dxa" w:w="2808"/>
-            <w:vAlign w:val="center"/>
-            <w:tcMar>
-              <w:top w:w="85" w:type="dxa"/>
-              <w:left w:w="85" w:type="dxa"/>
-              <w:bottom w:w="85" w:type="dxa"/>
-              <w:right w:w="85" w:type="dxa"/>
-            </w:tcMar>
-            <w:shd w:fill="343A40"/>
-          </w:tcPr>
-          <w:p>
-            <w:pPr>
-              <w:spacing w:after="20" w:line="247" w:lineRule="auto"/>
-            </w:pPr>
-            <w:r>
-              <w:rPr>
-                <w:b/>
-                <w:color w:val="FFFFFF"/>
-                <w:sz w:val="19"/>
-              </w:rPr>
-              <w:t>Candidate</w:t>
-            </w:r>
-          </w:p>
-        </w:tc>
-        <w:tc>
-          <w:tcPr>
-            <w:tcW w:type="dxa" w:w="6768"/>
-            <w:vAlign w:val="center"/>
-            <w:tcMar>
-              <w:top w:w="85" w:type="dxa"/>
-              <w:left w:w="85" w:type="dxa"/>
-              <w:bottom w:w="85" w:type="dxa"/>
-              <w:right w:w="85" w:type="dxa"/>
-            </w:tcMar>
-            <w:shd w:fill="343A40"/>
-          </w:tcPr>
-          <w:p>
-            <w:pPr>
-              <w:spacing w:after="20" w:line="247" w:lineRule="auto"/>
-            </w:pPr>
-            <w:r>
-              <w:rPr>
-                <w:b/>
-                <w:color w:val="FFFFFF"/>
-                <w:sz w:val="19"/>
-              </w:rPr>
-              <w:t>Assessment against the project objectives</w:t>
-            </w:r>
-          </w:p>
-        </w:tc>
-      </w:tr>
-      <w:tr>
-        <w:trPr>
-          <w:cantSplit/>
-        </w:trPr>
-        <w:tc>
-          <w:tcPr>
-            <w:tcW w:type="dxa" w:w="2808"/>
-            <w:vAlign w:val="center"/>
-            <w:tcMar>
-              <w:top w:w="85" w:type="dxa"/>
-              <w:left w:w="85" w:type="dxa"/>
-              <w:bottom w:w="85" w:type="dxa"/>
-              <w:right w:w="85" w:type="dxa"/>
-            </w:tcMar>
-            <w:shd w:fill="FFFFFF"/>
-          </w:tcPr>
-          <w:p>
-            <w:pPr>
-              <w:spacing w:after="20" w:line="247" w:lineRule="auto"/>
-            </w:pPr>
-            <w:r>
-              <w:rPr>
-                <w:b w:val="0"/>
-                <w:color w:val="000000"/>
-                <w:sz w:val="19"/>
-              </w:rPr>
-              <w:t>Passive weighted utensil</w:t>
-            </w:r>
-          </w:p>
-        </w:tc>
-        <w:tc>
-          <w:tcPr>
-            <w:tcW w:type="dxa" w:w="6768"/>
-            <w:vAlign w:val="center"/>
-            <w:tcMar>
-              <w:top w:w="85" w:type="dxa"/>
-              <w:left w:w="85" w:type="dxa"/>
-              <w:bottom w:w="85" w:type="dxa"/>
-              <w:right w:w="85" w:type="dxa"/>
-            </w:tcMar>
-            <w:shd w:fill="FFFFFF"/>
-          </w:tcPr>
-          <w:p>
-            <w:pPr>
-              <w:spacing w:after="20" w:line="247" w:lineRule="auto"/>
-            </w:pPr>
-            <w:r>
-              <w:rPr>
-                <w:b w:val="0"/>
-                <w:color w:val="000000"/>
-                <w:sz w:val="19"/>
-              </w:rPr>
-              <w:t>Simple implementation, but cannot actively regulate spoon attitude or explicitly preserve a measured motion intention.</w:t>
-            </w:r>
-          </w:p>
-        </w:tc>
-      </w:tr>
-      <w:tr>
-        <w:trPr>
-          <w:cantSplit/>
-        </w:trPr>
-        <w:tc>
-          <w:tcPr>
-            <w:tcW w:type="dxa" w:w="2808"/>
-            <w:vAlign w:val="center"/>
-            <w:tcMar>
-              <w:top w:w="85" w:type="dxa"/>
-              <w:left w:w="85" w:type="dxa"/>
-              <w:bottom w:w="85" w:type="dxa"/>
-              <w:right w:w="85" w:type="dxa"/>
-            </w:tcMar>
-            <w:shd w:fill="F2F4F6"/>
-          </w:tcPr>
-          <w:p>
-            <w:pPr>
-              <w:spacing w:after="20" w:line="247" w:lineRule="auto"/>
-            </w:pPr>
-            <w:r>
-              <w:rPr>
-                <w:b w:val="0"/>
-                <w:color w:val="000000"/>
-                <w:sz w:val="19"/>
-              </w:rPr>
-              <w:t>Rotary motor gimbal</w:t>
-            </w:r>
-          </w:p>
-        </w:tc>
-        <w:tc>
-          <w:tcPr>
-            <w:tcW w:type="dxa" w:w="6768"/>
-            <w:vAlign w:val="center"/>
-            <w:tcMar>
-              <w:top w:w="85" w:type="dxa"/>
-              <w:left w:w="85" w:type="dxa"/>
-              <w:bottom w:w="85" w:type="dxa"/>
-              <w:right w:w="85" w:type="dxa"/>
-            </w:tcMar>
-            <w:shd w:fill="F2F4F6"/>
-          </w:tcPr>
-          <w:p>
-            <w:pPr>
-              <w:spacing w:after="20" w:line="247" w:lineRule="auto"/>
-            </w:pPr>
-            <w:r>
-              <w:rPr>
-                <w:b w:val="0"/>
-                <w:color w:val="000000"/>
-                <w:sz w:val="19"/>
-              </w:rPr>
-              <w:t>Direct rotational actuation is possible; gear backlash and motor placement would require separate packaging and dynamic assessment.</w:t>
-            </w:r>
-          </w:p>
-        </w:tc>
-      </w:tr>
-      <w:tr>
-        <w:trPr>
-          <w:cantSplit/>
-        </w:trPr>
-        <w:tc>
-          <w:tcPr>
-            <w:tcW w:type="dxa" w:w="2808"/>
-            <w:vAlign w:val="center"/>
-            <w:tcMar>
-              <w:top w:w="85" w:type="dxa"/>
-              <w:left w:w="85" w:type="dxa"/>
-              <w:bottom w:w="85" w:type="dxa"/>
-              <w:right w:w="85" w:type="dxa"/>
-            </w:tcMar>
-            <w:shd w:fill="FFFFFF"/>
-          </w:tcPr>
-          <w:p>
-            <w:pPr>
-              <w:spacing w:after="20" w:line="247" w:lineRule="auto"/>
-            </w:pPr>
-            <w:r>
-              <w:rPr>
-                <w:b w:val="0"/>
-                <w:color w:val="000000"/>
-                <w:sz w:val="19"/>
-              </w:rPr>
-              <w:t>Grounded voice coils with flexures</w:t>
-            </w:r>
-          </w:p>
-        </w:tc>
-        <w:tc>
-          <w:tcPr>
-            <w:tcW w:type="dxa" w:w="6768"/>
-            <w:vAlign w:val="center"/>
-            <w:tcMar>
-              <w:top w:w="85" w:type="dxa"/>
-              <w:left w:w="85" w:type="dxa"/>
-              <w:bottom w:w="85" w:type="dxa"/>
-              <w:right w:w="85" w:type="dxa"/>
-            </w:tcMar>
-            <w:shd w:fill="FFFFFF"/>
-          </w:tcPr>
-          <w:p>
-            <w:pPr>
-              <w:spacing w:after="20" w:line="247" w:lineRule="auto"/>
-            </w:pPr>
-            <w:r>
-              <w:rPr>
-                <w:b w:val="0"/>
-                <w:color w:val="000000"/>
-                <w:sz w:val="19"/>
-              </w:rPr>
-              <w:t>Selected for reversible force control, direct rods and low-backlash pivots; limited travel and coupled force transmission remain design constraints.</w:t>
-            </w:r>
-          </w:p>
-        </w:tc>
-      </w:tr>
-    </w:tbl>
-    <w:p/>
-    <w:p>
-      <w:r>
-        <w:t>This is a qualitative engineering selection, not a measured competitor ranking. The proposed contribution is the integration of the mechanism, sensor feedback and optional intention assistance; novelty against published systems requires a separate literature comparison.</w:t>
-      </w:r>
-    </w:p>
-    <w:p>
-      <w:r>
-        <w:br w:type="page"/>
-      </w:r>
-    </w:p>
-    <w:p>
-      <w:pPr>
-        <w:pStyle w:val="Heading1"/>
-      </w:pPr>
-      <w:r>
-        <w:t>2 Detailed Design</w:t>
-      </w:r>
-    </w:p>
-    <w:p>
-      <w:pPr>
-        <w:pStyle w:val="Heading2"/>
-      </w:pPr>
-      <w:r>
-        <w:t>Mechanical architecture</w:t>
-      </w:r>
-    </w:p>
-    <w:p>
-      <w:r>
-        <w:t>The handle contains the fixed actuator housings, battery and main electronics. A custom moving carrier supports the detachable spoon at the front. Its spherical exterior follows two constrained flexure axes; it is not a free ball-and-socket joint. Two C-Flex B-10 pivots support pitch and one D-10 pivot supports roll [2, 3].</w:t>
+        <w:t>This is our current spoon design: a two-axis gimbal driven by two voice coils inside the handle. Dual IMUs provide motion feedback, with an optional EMG band to help estimate intentional movement. The MATLAB model is working; the physical assembly still needs prototype testing.</w:t>
       </w:r>
     </w:p>
     <w:p>
@@ -697,7 +67,7 @@
         <w:pStyle w:val="Caption"/>
       </w:pPr>
       <w:r>
-        <w:t>Figure 1. Current MATLAB geometry, shown assembled and in cutaway. These are model renders, not prototype photographs.</w:t>
+        <w:t>Current MATLAB model: assembled view and internal layout. These are simulation renders.</w:t>
       </w:r>
     </w:p>
     <w:p>
@@ -705,22 +75,12 @@
         <w:pStyle w:val="Heading2"/>
       </w:pPr>
       <w:r>
-        <w:t>How the pushrods create pitch and roll</w:t>
+        <w:t>Conceptual design</w:t>
       </w:r>
     </w:p>
     <w:p>
       <w:r>
-        <w:t>Each guided voice coil moves a rod forward or backward. The rods attach away from the gimbal axes and remain inclined as the mechanism moves. Their forces therefore create both pitch and roll moments. The controller coordinates both actuators; one coil is not assigned exclusively to pitch and the other to roll.</w:t>
-      </w:r>
-    </w:p>
-    <w:p>
-      <w:r>
-        <w:t>For roll, the useful moment comes from the transverse force components acting at offset attachment points. An offset alone is insufficient: a force exactly parallel to the spoon’s lengthwise axis produces no torque about that axis. Straight rods can provide roll authority when their installation angle and connection geometry are appropriate; a right-angle bend or bellcrank is not required.</w:t>
-      </w:r>
-    </w:p>
-    <w:p>
-      <w:r>
-        <w:t>The fixed-length rod constraints define actuator displacement as a function of the two joint angles. The transmission Jacobian converts joint velocity into rod velocity and rod force into joint torque. This configuration-dependent mapping is used in both the plant and controller, rather than assuming two independent ideal rotary actuators.</w:t>
+        <w:t>The aim is to keep the bowl steady while allowing the user to lift and move the spoon naturally. We chose handle-mounted voice coils and flexure pivots for reversible force control and low backlash. The spherical front cover hides a constrained pitch-and-roll mechanism, not a freely rotating ball joint.</w:t>
       </w:r>
     </w:p>
     <w:p>
@@ -728,394 +88,7 @@
         <w:pStyle w:val="Heading2"/>
       </w:pPr>
       <w:r>
-        <w:t>Packaging and dimensions</w:t>
-      </w:r>
-    </w:p>
-    <w:tbl>
-      <w:tblPr>
-        <w:tblW w:type="auto" w:w="0"/>
-        <w:jc w:val="center"/>
-        <w:tblLayout w:type="fixed"/>
-        <w:tblLook w:firstColumn="1" w:firstRow="1" w:lastColumn="0" w:lastRow="0" w:noHBand="0" w:noVBand="1" w:val="04A0"/>
-        <w:tblBorders>
-          <w:top w:val="single" w:sz="4" w:color="D9D9D9"/>
-          <w:left w:val="single" w:sz="4" w:color="D9D9D9"/>
-          <w:bottom w:val="single" w:sz="4" w:color="D9D9D9"/>
-          <w:right w:val="single" w:sz="4" w:color="D9D9D9"/>
-          <w:insideH w:val="single" w:sz="4" w:color="D9D9D9"/>
-          <w:insideV w:val="single" w:sz="4" w:color="D9D9D9"/>
-        </w:tblBorders>
-      </w:tblPr>
-      <w:tblGrid>
-        <w:gridCol w:w="2304"/>
-        <w:gridCol w:w="7272"/>
-      </w:tblGrid>
-      <w:tr>
-        <w:trPr>
-          <w:cantSplit/>
-          <w:tblHeader/>
-        </w:trPr>
-        <w:tc>
-          <w:tcPr>
-            <w:tcW w:type="dxa" w:w="2304"/>
-            <w:vAlign w:val="center"/>
-            <w:tcMar>
-              <w:top w:w="85" w:type="dxa"/>
-              <w:left w:w="85" w:type="dxa"/>
-              <w:bottom w:w="85" w:type="dxa"/>
-              <w:right w:w="85" w:type="dxa"/>
-            </w:tcMar>
-            <w:shd w:fill="343A40"/>
-          </w:tcPr>
-          <w:p>
-            <w:pPr>
-              <w:spacing w:after="20" w:line="247" w:lineRule="auto"/>
-            </w:pPr>
-            <w:r>
-              <w:rPr>
-                <w:b/>
-                <w:color w:val="FFFFFF"/>
-                <w:sz w:val="19"/>
-              </w:rPr>
-              <w:t>Feature</w:t>
-            </w:r>
-          </w:p>
-        </w:tc>
-        <w:tc>
-          <w:tcPr>
-            <w:tcW w:type="dxa" w:w="7272"/>
-            <w:vAlign w:val="center"/>
-            <w:tcMar>
-              <w:top w:w="85" w:type="dxa"/>
-              <w:left w:w="85" w:type="dxa"/>
-              <w:bottom w:w="85" w:type="dxa"/>
-              <w:right w:w="85" w:type="dxa"/>
-            </w:tcMar>
-            <w:shd w:fill="343A40"/>
-          </w:tcPr>
-          <w:p>
-            <w:pPr>
-              <w:spacing w:after="20" w:line="247" w:lineRule="auto"/>
-            </w:pPr>
-            <w:r>
-              <w:rPr>
-                <w:b/>
-                <w:color w:val="FFFFFF"/>
-                <w:sz w:val="19"/>
-              </w:rPr>
-              <w:t>Current nominal geometry</w:t>
-            </w:r>
-          </w:p>
-        </w:tc>
-      </w:tr>
-      <w:tr>
-        <w:trPr>
-          <w:cantSplit/>
-        </w:trPr>
-        <w:tc>
-          <w:tcPr>
-            <w:tcW w:type="dxa" w:w="2304"/>
-            <w:vAlign w:val="center"/>
-            <w:tcMar>
-              <w:top w:w="85" w:type="dxa"/>
-              <w:left w:w="85" w:type="dxa"/>
-              <w:bottom w:w="85" w:type="dxa"/>
-              <w:right w:w="85" w:type="dxa"/>
-            </w:tcMar>
-            <w:shd w:fill="FFFFFF"/>
-          </w:tcPr>
-          <w:p>
-            <w:pPr>
-              <w:spacing w:after="20" w:line="247" w:lineRule="auto"/>
-            </w:pPr>
-            <w:r>
-              <w:rPr>
-                <w:b w:val="0"/>
-                <w:color w:val="000000"/>
-                <w:sz w:val="19"/>
-              </w:rPr>
-              <w:t>Overall length</w:t>
-            </w:r>
-          </w:p>
-        </w:tc>
-        <w:tc>
-          <w:tcPr>
-            <w:tcW w:type="dxa" w:w="7272"/>
-            <w:vAlign w:val="center"/>
-            <w:tcMar>
-              <w:top w:w="85" w:type="dxa"/>
-              <w:left w:w="85" w:type="dxa"/>
-              <w:bottom w:w="85" w:type="dxa"/>
-              <w:right w:w="85" w:type="dxa"/>
-            </w:tcMar>
-            <w:shd w:fill="FFFFFF"/>
-          </w:tcPr>
-          <w:p>
-            <w:pPr>
-              <w:spacing w:after="20" w:line="247" w:lineRule="auto"/>
-            </w:pPr>
-            <w:r>
-              <w:rPr>
-                <w:b w:val="0"/>
-                <w:color w:val="000000"/>
-                <w:sz w:val="19"/>
-              </w:rPr>
-              <w:t>271 mm</w:t>
-            </w:r>
-          </w:p>
-        </w:tc>
-      </w:tr>
-      <w:tr>
-        <w:trPr>
-          <w:cantSplit/>
-        </w:trPr>
-        <w:tc>
-          <w:tcPr>
-            <w:tcW w:type="dxa" w:w="2304"/>
-            <w:vAlign w:val="center"/>
-            <w:tcMar>
-              <w:top w:w="85" w:type="dxa"/>
-              <w:left w:w="85" w:type="dxa"/>
-              <w:bottom w:w="85" w:type="dxa"/>
-              <w:right w:w="85" w:type="dxa"/>
-            </w:tcMar>
-            <w:shd w:fill="F2F4F6"/>
-          </w:tcPr>
-          <w:p>
-            <w:pPr>
-              <w:spacing w:after="20" w:line="247" w:lineRule="auto"/>
-            </w:pPr>
-            <w:r>
-              <w:rPr>
-                <w:b w:val="0"/>
-                <w:color w:val="000000"/>
-                <w:sz w:val="19"/>
-              </w:rPr>
-              <w:t>Spoon bowl and neck</w:t>
-            </w:r>
-          </w:p>
-        </w:tc>
-        <w:tc>
-          <w:tcPr>
-            <w:tcW w:type="dxa" w:w="7272"/>
-            <w:vAlign w:val="center"/>
-            <w:tcMar>
-              <w:top w:w="85" w:type="dxa"/>
-              <w:left w:w="85" w:type="dxa"/>
-              <w:bottom w:w="85" w:type="dxa"/>
-              <w:right w:w="85" w:type="dxa"/>
-            </w:tcMar>
-            <w:shd w:fill="F2F4F6"/>
-          </w:tcPr>
-          <w:p>
-            <w:pPr>
-              <w:spacing w:after="20" w:line="247" w:lineRule="auto"/>
-            </w:pPr>
-            <w:r>
-              <w:rPr>
-                <w:b w:val="0"/>
-                <w:color w:val="000000"/>
-                <w:sz w:val="19"/>
-              </w:rPr>
-              <w:t>62 × 40 × 12 mm bowl; 31 mm curved neck; 1.2 mm rim and 1.8 mm bottom thickness</w:t>
-            </w:r>
-          </w:p>
-        </w:tc>
-      </w:tr>
-      <w:tr>
-        <w:trPr>
-          <w:cantSplit/>
-        </w:trPr>
-        <w:tc>
-          <w:tcPr>
-            <w:tcW w:type="dxa" w:w="2304"/>
-            <w:vAlign w:val="center"/>
-            <w:tcMar>
-              <w:top w:w="85" w:type="dxa"/>
-              <w:left w:w="85" w:type="dxa"/>
-              <w:bottom w:w="85" w:type="dxa"/>
-              <w:right w:w="85" w:type="dxa"/>
-            </w:tcMar>
-            <w:shd w:fill="FFFFFF"/>
-          </w:tcPr>
-          <w:p>
-            <w:pPr>
-              <w:spacing w:after="20" w:line="247" w:lineRule="auto"/>
-            </w:pPr>
-            <w:r>
-              <w:rPr>
-                <w:b w:val="0"/>
-                <w:color w:val="000000"/>
-                <w:sz w:val="19"/>
-              </w:rPr>
-              <w:t>Grip sections</w:t>
-            </w:r>
-          </w:p>
-        </w:tc>
-        <w:tc>
-          <w:tcPr>
-            <w:tcW w:type="dxa" w:w="7272"/>
-            <w:vAlign w:val="center"/>
-            <w:tcMar>
-              <w:top w:w="85" w:type="dxa"/>
-              <w:left w:w="85" w:type="dxa"/>
-              <w:bottom w:w="85" w:type="dxa"/>
-              <w:right w:w="85" w:type="dxa"/>
-            </w:tcMar>
-            <w:shd w:fill="FFFFFF"/>
-          </w:tcPr>
-          <w:p>
-            <w:pPr>
-              <w:spacing w:after="20" w:line="247" w:lineRule="auto"/>
-            </w:pPr>
-            <w:r>
-              <w:rPr>
-                <w:b w:val="0"/>
-                <w:color w:val="000000"/>
-                <w:sz w:val="19"/>
-              </w:rPr>
-              <w:t>Approximately 33 × 28 mm near the forward grip and 34.4 × 30 mm toward the rear</w:t>
-            </w:r>
-          </w:p>
-        </w:tc>
-      </w:tr>
-      <w:tr>
-        <w:trPr>
-          <w:cantSplit/>
-        </w:trPr>
-        <w:tc>
-          <w:tcPr>
-            <w:tcW w:type="dxa" w:w="2304"/>
-            <w:vAlign w:val="center"/>
-            <w:tcMar>
-              <w:top w:w="85" w:type="dxa"/>
-              <w:left w:w="85" w:type="dxa"/>
-              <w:bottom w:w="85" w:type="dxa"/>
-              <w:right w:w="85" w:type="dxa"/>
-            </w:tcMar>
-            <w:shd w:fill="F2F4F6"/>
-          </w:tcPr>
-          <w:p>
-            <w:pPr>
-              <w:spacing w:after="20" w:line="247" w:lineRule="auto"/>
-            </w:pPr>
-            <w:r>
-              <w:rPr>
-                <w:b w:val="0"/>
-                <w:color w:val="000000"/>
-                <w:sz w:val="19"/>
-              </w:rPr>
-              <w:t>Front assembly</w:t>
-            </w:r>
-          </w:p>
-        </w:tc>
-        <w:tc>
-          <w:tcPr>
-            <w:tcW w:type="dxa" w:w="7272"/>
-            <w:vAlign w:val="center"/>
-            <w:tcMar>
-              <w:top w:w="85" w:type="dxa"/>
-              <w:left w:w="85" w:type="dxa"/>
-              <w:bottom w:w="85" w:type="dxa"/>
-              <w:right w:w="85" w:type="dxa"/>
-            </w:tcMar>
-            <w:shd w:fill="F2F4F6"/>
-          </w:tcPr>
-          <w:p>
-            <w:pPr>
-              <w:spacing w:after="20" w:line="247" w:lineRule="auto"/>
-            </w:pPr>
-            <w:r>
-              <w:rPr>
-                <w:b w:val="0"/>
-                <w:color w:val="000000"/>
-                <w:sz w:val="19"/>
-              </w:rPr>
-              <w:t>42 mm maximum fixed-bezel diameter; 34 mm moving-carrier diameter</w:t>
-            </w:r>
-          </w:p>
-        </w:tc>
-      </w:tr>
-      <w:tr>
-        <w:trPr>
-          <w:cantSplit/>
-        </w:trPr>
-        <w:tc>
-          <w:tcPr>
-            <w:tcW w:type="dxa" w:w="2304"/>
-            <w:vAlign w:val="center"/>
-            <w:tcMar>
-              <w:top w:w="85" w:type="dxa"/>
-              <w:left w:w="85" w:type="dxa"/>
-              <w:bottom w:w="85" w:type="dxa"/>
-              <w:right w:w="85" w:type="dxa"/>
-            </w:tcMar>
-            <w:shd w:fill="FFFFFF"/>
-          </w:tcPr>
-          <w:p>
-            <w:pPr>
-              <w:spacing w:after="20" w:line="247" w:lineRule="auto"/>
-            </w:pPr>
-            <w:r>
-              <w:rPr>
-                <w:b w:val="0"/>
-                <w:color w:val="000000"/>
-                <w:sz w:val="19"/>
-              </w:rPr>
-              <w:t>Actuator arrangement</w:t>
-            </w:r>
-          </w:p>
-        </w:tc>
-        <w:tc>
-          <w:tcPr>
-            <w:tcW w:type="dxa" w:w="7272"/>
-            <w:vAlign w:val="center"/>
-            <w:tcMar>
-              <w:top w:w="85" w:type="dxa"/>
-              <w:left w:w="85" w:type="dxa"/>
-              <w:bottom w:w="85" w:type="dxa"/>
-              <w:right w:w="85" w:type="dxa"/>
-            </w:tcMar>
-            <w:shd w:fill="FFFFFF"/>
-          </w:tcPr>
-          <w:p>
-            <w:pPr>
-              <w:spacing w:after="20" w:line="247" w:lineRule="auto"/>
-            </w:pPr>
-            <w:r>
-              <w:rPr>
-                <w:b w:val="0"/>
-                <w:color w:val="000000"/>
-                <w:sz w:val="19"/>
-              </w:rPr>
-              <w:t>Staggered longitudinally; rear actuator uses a 32 mm long, 3 mm diameter coaxial extension</w:t>
-            </w:r>
-          </w:p>
-        </w:tc>
-      </w:tr>
-    </w:tbl>
-    <w:p/>
-    <w:p>
-      <w:r>
-        <w:t>Staggering the actuators trades additional length for a narrower grip. The bowl and neck use smooth transitions to retain a familiar spoon profile. The current dimensions are design values, not an ergonomic validation. The rotation centre is an equivalent local flexure centre; a remote centre of motion has not been established.</w:t>
-      </w:r>
-    </w:p>
-    <w:p>
-      <w:r>
-        <w:br w:type="page"/>
-      </w:r>
-    </w:p>
-    <w:p>
-      <w:pPr>
-        <w:pStyle w:val="Heading1"/>
-      </w:pPr>
-      <w:r>
-        <w:t>Actuators and component selection</w:t>
-      </w:r>
-    </w:p>
-    <w:p>
-      <w:r>
-        <w:t>The voice coils are linear motors: current produces bidirectional force, and reversing current reverses the force. Their housings remain fixed to the handle, while the coil movers, rods and spoon mechanism contribute to moving inertia. Catalogue components provide the hardware basis; the assembled gimbal and its connecting parts remain custom [1–6].</w:t>
+        <w:t>Detailed design</w:t>
       </w:r>
     </w:p>
     <w:tbl>
@@ -1135,8 +108,7 @@
       </w:tblPr>
       <w:tblGrid>
         <w:gridCol w:w="1800"/>
-        <w:gridCol w:w="576"/>
-        <w:gridCol w:w="7200"/>
+        <w:gridCol w:w="7776"/>
       </w:tblGrid>
       <w:tr>
         <w:trPr>
@@ -1165,13 +137,13 @@
                 <w:color w:val="FFFFFF"/>
                 <w:sz w:val="19"/>
               </w:rPr>
-              <w:t>Component</w:t>
+              <w:t>Part</w:t>
             </w:r>
           </w:p>
         </w:tc>
         <w:tc>
           <w:tcPr>
-            <w:tcW w:type="dxa" w:w="576"/>
+            <w:tcW w:type="dxa" w:w="7776"/>
             <w:vAlign w:val="center"/>
             <w:tcMar>
               <w:top w:w="85" w:type="dxa"/>
@@ -1191,33 +163,7 @@
                 <w:color w:val="FFFFFF"/>
                 <w:sz w:val="19"/>
               </w:rPr>
-              <w:t>Qty</w:t>
-            </w:r>
-          </w:p>
-        </w:tc>
-        <w:tc>
-          <w:tcPr>
-            <w:tcW w:type="dxa" w:w="7200"/>
-            <w:vAlign w:val="center"/>
-            <w:tcMar>
-              <w:top w:w="85" w:type="dxa"/>
-              <w:left w:w="85" w:type="dxa"/>
-              <w:bottom w:w="85" w:type="dxa"/>
-              <w:right w:w="85" w:type="dxa"/>
-            </w:tcMar>
-            <w:shd w:fill="343A40"/>
-          </w:tcPr>
-          <w:p>
-            <w:pPr>
-              <w:spacing w:after="20" w:line="247" w:lineRule="auto"/>
-            </w:pPr>
-            <w:r>
-              <w:rPr>
-                <w:b/>
-                <w:color w:val="FFFFFF"/>
-                <w:sz w:val="19"/>
-              </w:rPr>
-              <w:t>Selection and relevant specification</w:t>
+              <w:t>Current choice</w:t>
             </w:r>
           </w:p>
         </w:tc>
@@ -1248,13 +194,13 @@
                 <w:color w:val="000000"/>
                 <w:sz w:val="19"/>
               </w:rPr>
-              <w:t>Guided voice coil</w:t>
+              <w:t>Actuation</w:t>
             </w:r>
           </w:p>
         </w:tc>
         <w:tc>
           <w:tcPr>
-            <w:tcW w:type="dxa" w:w="576"/>
+            <w:tcW w:type="dxa" w:w="7776"/>
             <w:vAlign w:val="center"/>
             <w:tcMar>
               <w:top w:w="85" w:type="dxa"/>
@@ -1274,33 +220,7 @@
                 <w:color w:val="000000"/>
                 <w:sz w:val="19"/>
               </w:rPr>
-              <w:t>2</w:t>
-            </w:r>
-          </w:p>
-        </w:tc>
-        <w:tc>
-          <w:tcPr>
-            <w:tcW w:type="dxa" w:w="7200"/>
-            <w:vAlign w:val="center"/>
-            <w:tcMar>
-              <w:top w:w="85" w:type="dxa"/>
-              <w:left w:w="85" w:type="dxa"/>
-              <w:bottom w:w="85" w:type="dxa"/>
-              <w:right w:w="85" w:type="dxa"/>
-            </w:tcMar>
-            <w:shd w:fill="FFFFFF"/>
-          </w:tcPr>
-          <w:p>
-            <w:pPr>
-              <w:spacing w:after="20" w:line="247" w:lineRule="auto"/>
-            </w:pPr>
-            <w:r>
-              <w:rPr>
-                <w:b w:val="0"/>
-                <w:color w:val="000000"/>
-                <w:sz w:val="19"/>
-              </w:rPr>
-              <w:t>Moticont GVCM-016-019-01M; 15.9 mm diameter, 12.7 mm total stroke, 1.5 N continuous force; 4.6 N intermittent at 10% duty [1].</w:t>
+              <w:t>2 × Moticont GVCM-016-019-01M voice coils; 12.7 mm total stroke. Housings fixed to the handle.</w:t>
             </w:r>
           </w:p>
         </w:tc>
@@ -1331,13 +251,13 @@
                 <w:color w:val="000000"/>
                 <w:sz w:val="19"/>
               </w:rPr>
-              <w:t>Flexure pivots</w:t>
+              <w:t>Gimbal</w:t>
             </w:r>
           </w:p>
         </w:tc>
         <w:tc>
           <w:tcPr>
-            <w:tcW w:type="dxa" w:w="576"/>
+            <w:tcW w:type="dxa" w:w="7776"/>
             <w:vAlign w:val="center"/>
             <w:tcMar>
               <w:top w:w="85" w:type="dxa"/>
@@ -1357,33 +277,7 @@
                 <w:color w:val="000000"/>
                 <w:sz w:val="19"/>
               </w:rPr>
-              <w:t>3</w:t>
-            </w:r>
-          </w:p>
-        </w:tc>
-        <w:tc>
-          <w:tcPr>
-            <w:tcW w:type="dxa" w:w="7200"/>
-            <w:vAlign w:val="center"/>
-            <w:tcMar>
-              <w:top w:w="85" w:type="dxa"/>
-              <w:left w:w="85" w:type="dxa"/>
-              <w:bottom w:w="85" w:type="dxa"/>
-              <w:right w:w="85" w:type="dxa"/>
-            </w:tcMar>
-            <w:shd w:fill="F2F4F6"/>
-          </w:tcPr>
-          <w:p>
-            <w:pPr>
-              <w:spacing w:after="20" w:line="247" w:lineRule="auto"/>
-            </w:pPr>
-            <w:r>
-              <w:rPr>
-                <w:b w:val="0"/>
-                <w:color w:val="000000"/>
-                <w:sz w:val="19"/>
-              </w:rPr>
-              <w:t>C-Flex B-10 ×2 for pitch and D-10 ×1 for roll. Model torsional stiffness: 0.00518 and 0.01165 N m/rad respectively [2, 3].</w:t>
+              <w:t>2 × C-Flex B-10 pitch pivots and 1 × D-10 roll pivot; custom carrier, mounts and rod ends.</w:t>
             </w:r>
           </w:p>
         </w:tc>
@@ -1414,13 +308,13 @@
                 <w:color w:val="000000"/>
                 <w:sz w:val="19"/>
               </w:rPr>
-              <w:t>H-bridge driver</w:t>
+              <w:t>Transmission</w:t>
             </w:r>
           </w:p>
         </w:tc>
         <w:tc>
           <w:tcPr>
-            <w:tcW w:type="dxa" w:w="576"/>
+            <w:tcW w:type="dxa" w:w="7776"/>
             <w:vAlign w:val="center"/>
             <w:tcMar>
               <w:top w:w="85" w:type="dxa"/>
@@ -1440,33 +334,7 @@
                 <w:color w:val="000000"/>
                 <w:sz w:val="19"/>
               </w:rPr>
-              <w:t>2</w:t>
-            </w:r>
-          </w:p>
-        </w:tc>
-        <w:tc>
-          <w:tcPr>
-            <w:tcW w:type="dxa" w:w="7200"/>
-            <w:vAlign w:val="center"/>
-            <w:tcMar>
-              <w:top w:w="85" w:type="dxa"/>
-              <w:left w:w="85" w:type="dxa"/>
-              <w:bottom w:w="85" w:type="dxa"/>
-              <w:right w:w="85" w:type="dxa"/>
-            </w:tcMar>
-            <w:shd w:fill="FFFFFF"/>
-          </w:tcPr>
-          <w:p>
-            <w:pPr>
-              <w:spacing w:after="20" w:line="247" w:lineRule="auto"/>
-            </w:pPr>
-            <w:r>
-              <w:rPr>
-                <w:b w:val="0"/>
-                <w:color w:val="000000"/>
-                <w:sz w:val="19"/>
-              </w:rPr>
-              <w:t>TI DRV8876PWPR; bidirectional current control. The project uses a 1.5 A current limit, below the device’s 3.5 A peak rating [4].</w:t>
+              <w:t>Two straight but inclined pushrods. Staggered actuators keep the grip narrower; the rear unit has a shaft extension.</w:t>
             </w:r>
           </w:p>
         </w:tc>
@@ -1497,13 +365,13 @@
                 <w:color w:val="000000"/>
                 <w:sz w:val="19"/>
               </w:rPr>
-              <w:t>IMU</w:t>
+              <w:t>Electronics</w:t>
             </w:r>
           </w:p>
         </w:tc>
         <w:tc>
           <w:tcPr>
-            <w:tcW w:type="dxa" w:w="576"/>
+            <w:tcW w:type="dxa" w:w="7776"/>
             <w:vAlign w:val="center"/>
             <w:tcMar>
               <w:top w:w="85" w:type="dxa"/>
@@ -1523,33 +391,7 @@
                 <w:color w:val="000000"/>
                 <w:sz w:val="19"/>
               </w:rPr>
-              <w:t>2</w:t>
-            </w:r>
-          </w:p>
-        </w:tc>
-        <w:tc>
-          <w:tcPr>
-            <w:tcW w:type="dxa" w:w="7200"/>
-            <w:vAlign w:val="center"/>
-            <w:tcMar>
-              <w:top w:w="85" w:type="dxa"/>
-              <w:left w:w="85" w:type="dxa"/>
-              <w:bottom w:w="85" w:type="dxa"/>
-              <w:right w:w="85" w:type="dxa"/>
-            </w:tcMar>
-            <w:shd w:fill="F2F4F6"/>
-          </w:tcPr>
-          <w:p>
-            <w:pPr>
-              <w:spacing w:after="20" w:line="247" w:lineRule="auto"/>
-            </w:pPr>
-            <w:r>
-              <w:rPr>
-                <w:b w:val="0"/>
-                <w:color w:val="000000"/>
-                <w:sz w:val="19"/>
-              </w:rPr>
-              <w:t>Bosch BMI270, one on the handle and one on the moving spoon carrier. Selected sampling: 800 Hz, ±500°/s and ±8 g [5].</w:t>
+              <w:t>2 × BMI270 IMUs, 2 × DRV8876 drivers and an STM32G431CBT6 MCU. Main PCB layout is not finished.</w:t>
             </w:r>
           </w:p>
         </w:tc>
@@ -1580,13 +422,13 @@
                 <w:color w:val="000000"/>
                 <w:sz w:val="19"/>
               </w:rPr>
-              <w:t>Microcontroller</w:t>
+              <w:t>Size and power</w:t>
             </w:r>
           </w:p>
         </w:tc>
         <w:tc>
           <w:tcPr>
-            <w:tcW w:type="dxa" w:w="576"/>
+            <w:tcW w:type="dxa" w:w="7776"/>
             <w:vAlign w:val="center"/>
             <w:tcMar>
               <w:top w:w="85" w:type="dxa"/>
@@ -1606,199 +448,7 @@
                 <w:color w:val="000000"/>
                 <w:sz w:val="19"/>
               </w:rPr>
-              <w:t>1</w:t>
-            </w:r>
-          </w:p>
-        </w:tc>
-        <w:tc>
-          <w:tcPr>
-            <w:tcW w:type="dxa" w:w="7200"/>
-            <w:vAlign w:val="center"/>
-            <w:tcMar>
-              <w:top w:w="85" w:type="dxa"/>
-              <w:left w:w="85" w:type="dxa"/>
-              <w:bottom w:w="85" w:type="dxa"/>
-              <w:right w:w="85" w:type="dxa"/>
-            </w:tcMar>
-            <w:shd w:fill="FFFFFF"/>
-          </w:tcPr>
-          <w:p>
-            <w:pPr>
-              <w:spacing w:after="20" w:line="247" w:lineRule="auto"/>
-            </w:pPr>
-            <w:r>
-              <w:rPr>
-                <w:b w:val="0"/>
-                <w:color w:val="000000"/>
-                <w:sz w:val="19"/>
-              </w:rPr>
-              <w:t>STM32G431CBT6; 170 MHz Cortex-M4 with floating-point support. Firmware timing is not yet validated [6].</w:t>
-            </w:r>
-          </w:p>
-        </w:tc>
-      </w:tr>
-      <w:tr>
-        <w:trPr>
-          <w:cantSplit/>
-        </w:trPr>
-        <w:tc>
-          <w:tcPr>
-            <w:tcW w:type="dxa" w:w="1800"/>
-            <w:vAlign w:val="center"/>
-            <w:tcMar>
-              <w:top w:w="85" w:type="dxa"/>
-              <w:left w:w="85" w:type="dxa"/>
-              <w:bottom w:w="85" w:type="dxa"/>
-              <w:right w:w="85" w:type="dxa"/>
-            </w:tcMar>
-            <w:shd w:fill="F2F4F6"/>
-          </w:tcPr>
-          <w:p>
-            <w:pPr>
-              <w:spacing w:after="20" w:line="247" w:lineRule="auto"/>
-            </w:pPr>
-            <w:r>
-              <w:rPr>
-                <w:b w:val="0"/>
-                <w:color w:val="000000"/>
-                <w:sz w:val="19"/>
-              </w:rPr>
-              <w:t>Battery and PCB</w:t>
-            </w:r>
-          </w:p>
-        </w:tc>
-        <w:tc>
-          <w:tcPr>
-            <w:tcW w:type="dxa" w:w="576"/>
-            <w:vAlign w:val="center"/>
-            <w:tcMar>
-              <w:top w:w="85" w:type="dxa"/>
-              <w:left w:w="85" w:type="dxa"/>
-              <w:bottom w:w="85" w:type="dxa"/>
-              <w:right w:w="85" w:type="dxa"/>
-            </w:tcMar>
-            <w:shd w:fill="F2F4F6"/>
-          </w:tcPr>
-          <w:p>
-            <w:pPr>
-              <w:spacing w:after="20" w:line="247" w:lineRule="auto"/>
-            </w:pPr>
-            <w:r>
-              <w:rPr>
-                <w:b w:val="0"/>
-                <w:color w:val="000000"/>
-                <w:sz w:val="19"/>
-              </w:rPr>
-              <w:t>1 set</w:t>
-            </w:r>
-          </w:p>
-        </w:tc>
-        <w:tc>
-          <w:tcPr>
-            <w:tcW w:type="dxa" w:w="7200"/>
-            <w:vAlign w:val="center"/>
-            <w:tcMar>
-              <w:top w:w="85" w:type="dxa"/>
-              <w:left w:w="85" w:type="dxa"/>
-              <w:bottom w:w="85" w:type="dxa"/>
-              <w:right w:w="85" w:type="dxa"/>
-            </w:tcMar>
-            <w:shd w:fill="F2F4F6"/>
-          </w:tcPr>
-          <w:p>
-            <w:pPr>
-              <w:spacing w:after="20" w:line="247" w:lineRule="auto"/>
-            </w:pPr>
-            <w:r>
-              <w:rPr>
-                <w:b w:val="0"/>
-                <w:color w:val="000000"/>
-                <w:sz w:val="19"/>
-              </w:rPr>
-              <w:t>Model supply: 2S, 7.4 V, 400 mAh; battery envelope 41 × 20 × 13 mm. Main PCB target: 45 × 16 mm; routing remains unfinished.</w:t>
-            </w:r>
-          </w:p>
-        </w:tc>
-      </w:tr>
-      <w:tr>
-        <w:trPr>
-          <w:cantSplit/>
-        </w:trPr>
-        <w:tc>
-          <w:tcPr>
-            <w:tcW w:type="dxa" w:w="1800"/>
-            <w:vAlign w:val="center"/>
-            <w:tcMar>
-              <w:top w:w="85" w:type="dxa"/>
-              <w:left w:w="85" w:type="dxa"/>
-              <w:bottom w:w="85" w:type="dxa"/>
-              <w:right w:w="85" w:type="dxa"/>
-            </w:tcMar>
-            <w:shd w:fill="FFFFFF"/>
-          </w:tcPr>
-          <w:p>
-            <w:pPr>
-              <w:spacing w:after="20" w:line="247" w:lineRule="auto"/>
-            </w:pPr>
-            <w:r>
-              <w:rPr>
-                <w:b w:val="0"/>
-                <w:color w:val="000000"/>
-                <w:sz w:val="19"/>
-              </w:rPr>
-              <w:t>Custom mechanics</w:t>
-            </w:r>
-          </w:p>
-        </w:tc>
-        <w:tc>
-          <w:tcPr>
-            <w:tcW w:type="dxa" w:w="576"/>
-            <w:vAlign w:val="center"/>
-            <w:tcMar>
-              <w:top w:w="85" w:type="dxa"/>
-              <w:left w:w="85" w:type="dxa"/>
-              <w:bottom w:w="85" w:type="dxa"/>
-              <w:right w:w="85" w:type="dxa"/>
-            </w:tcMar>
-            <w:shd w:fill="FFFFFF"/>
-          </w:tcPr>
-          <w:p>
-            <w:pPr>
-              <w:spacing w:after="20" w:line="247" w:lineRule="auto"/>
-            </w:pPr>
-            <w:r>
-              <w:rPr>
-                <w:b w:val="0"/>
-                <w:color w:val="000000"/>
-                <w:sz w:val="19"/>
-              </w:rPr>
-              <w:t>1 set</w:t>
-            </w:r>
-          </w:p>
-        </w:tc>
-        <w:tc>
-          <w:tcPr>
-            <w:tcW w:type="dxa" w:w="7200"/>
-            <w:vAlign w:val="center"/>
-            <w:tcMar>
-              <w:top w:w="85" w:type="dxa"/>
-              <w:left w:w="85" w:type="dxa"/>
-              <w:bottom w:w="85" w:type="dxa"/>
-              <w:right w:w="85" w:type="dxa"/>
-            </w:tcMar>
-            <w:shd w:fill="FFFFFF"/>
-          </w:tcPr>
-          <w:p>
-            <w:pPr>
-              <w:spacing w:after="20" w:line="247" w:lineRule="auto"/>
-            </w:pPr>
-            <w:r>
-              <w:rPr>
-                <w:b w:val="0"/>
-                <w:color w:val="000000"/>
-                <w:sz w:val="19"/>
-              </w:rPr>
-              <w:t>Carrier, frames, rods, rod ends, shaft extension, quick release and enclosure. Final tolerances and manufacturing drawings are still required.</w:t>
+              <w:t>271 mm overall; bowl 62 × 40 × 12 mm; 31 mm curved neck; model supply 7.4 V, 400 mAh.</w:t>
             </w:r>
           </w:p>
         </w:tc>
@@ -1810,30 +460,12 @@
         <w:pStyle w:val="Heading2"/>
       </w:pPr>
       <w:r>
-        <w:t>Physical model and electrical limits</w:t>
+        <w:t>How pitch and roll work</w:t>
       </w:r>
     </w:p>
     <w:p>
       <w:r>
-        <w:t>The analytical plant has eight continuous states: two joint angles, two angular velocities, two coil currents and two temperature rises. Coil current follows an RL model with driver resistance and back electromotive force. Electromagnetic force acts through the rod geometry to drive coupled rigid-body dynamics, including gravity, base acceleration, springs, damping, friction and compliant stops.</w:t>
-      </w:r>
-    </w:p>
-    <w:p>
-      <w:r>
-        <w:t>The nominal coil parameters are 4.6 Ω resistance, 0.8 mH inductance and a 1.5 N/A force constant. Stroke-dependent force variation, friction and thermal properties include uncalibrated assumptions. The peak catalogue force is not treated as continuous authority. Current allocation accounts for the model’s current, average copper-loss and shaft side-load limits.</w:t>
-      </w:r>
-    </w:p>
-    <w:p>
-      <w:pPr>
-        <w:pStyle w:val="Heading2"/>
-      </w:pPr>
-      <w:r>
-        <w:t>Mechanical detail still requiring verification</w:t>
-      </w:r>
-    </w:p>
-    <w:p>
-      <w:r>
-        <w:t>The model includes the mass of both 11 g movers and the rear extension. Its approximately 0.55 mm nominal extension clearance is not a tolerance analysis. Custom rod ends must accommodate angular motion without binding, and the manufacturer’s 2.2 N shaft side-load rating does not certify the extension’s bending moment. Flexure life depends on load and angle; the catalogue ±15° indefinite-life statement applies at zero load [2, 3].</w:t>
+        <w:t>Pitch moves the tip up and down. Roll lifts one side of the bowl while lowering the other. Both coils work together for both axes. Roll torque comes from offset attachment points and transverse pushrod forces: offset alone is not enough if the force is exactly parallel to the spoon’s length. No right-angle rod bend is needed.</w:t>
       </w:r>
     </w:p>
     <w:p>
@@ -1846,51 +478,63 @@
         <w:pStyle w:val="Heading1"/>
       </w:pPr>
       <w:r>
-        <w:t>Sensing and motion control</w:t>
+        <w:t>Control and EMG</w:t>
       </w:r>
     </w:p>
     <w:p>
       <w:r>
-        <w:t>Two IMUs measure handle and spoon motion so that the controller can estimate their orientations and relative rotation. Gyroscope integration is corrected slowly using accelerometer information. The simulated measurements include bias, noise, quantisation, filtering and one-sample delay. Accelerometers measure specific force, so rapid translation can disturb the gravity-based attitude correction.</w:t>
+        <w:t>The two IMUs measure handle and spoon motion. An 800 Hz attitude controller estimates the intended movement and requests compensating torque; a 10 kHz current controller drives the coils. Commanded relative angles are limited to ±14°, with compliant stops modelled at ±15°.</w:t>
+      </w:r>
+    </w:p>
+    <w:p>
+      <w:r>
+        <w:t>The optional four-channel EMG band measures forearm muscle activity. After calibration, it adds a small correction to the intended-motion estimate; it does not move the spoon or stimulate muscles. It is disabled by default and falls back to IMU-only control when its signal is invalid. Current EMG data are synthetic, not human recordings.</w:t>
       </w:r>
     </w:p>
     <w:p>
       <w:pPr>
-        <w:keepNext/>
+        <w:pStyle w:val="Heading2"/>
       </w:pPr>
       <w:r>
-        <w:drawing>
-          <wp:inline xmlns:a="http://schemas.openxmlformats.org/drawingml/2006/main" xmlns:pic="http://schemas.openxmlformats.org/drawingml/2006/picture">
-            <wp:extent cx="6080760" cy="1466536"/>
-            <wp:docPr id="2" name="Picture 2"/>
-            <wp:cNvGraphicFramePr>
-              <a:graphicFrameLocks noChangeAspect="1"/>
-            </wp:cNvGraphicFramePr>
-            <a:graphic>
-              <a:graphicData uri="http://schemas.openxmlformats.org/drawingml/2006/picture">
-                <pic:pic>
-                  <pic:nvPicPr>
-                    <pic:cNvPr id="0" name="architecture.png"/>
-                    <pic:cNvPicPr/>
-                  </pic:nvPicPr>
-                  <pic:blipFill>
-                    <a:blip r:embed="rId11"/>
-                    <a:stretch>
-                      <a:fillRect/>
-                    </a:stretch>
-                  </pic:blipFill>
-                  <pic:spPr>
-                    <a:xfrm>
-                      <a:off x="0" y="0"/>
-                      <a:ext cx="6080760" cy="1466536"/>
-                    </a:xfrm>
-                    <a:prstGeom prst="rect"/>
-                  </pic:spPr>
-                </pic:pic>
-              </a:graphicData>
-            </a:graphic>
-          </wp:inline>
-        </w:drawing>
+        <w:t>What the simulation shows</w:t>
+      </w:r>
+    </w:p>
+    <w:p>
+      <w:r>
+        <w:t>• Strong-tremor case: 4 Hz, 5° per axis and 8 mL of soup. Attitude vibration falls by about 92.6%; estimated spill is 2.73 mL without control and zero with control.</w:t>
+      </w:r>
+    </w:p>
+    <w:p>
+      <w:r>
+        <w:t>• EMG comparison: in a separate voluntary-motion-plus-tremor trial, attitude RMS error falls from 0.498° to 0.418°, but peak current rises from 0.80 A to 1.33 A.</w:t>
+      </w:r>
+    </w:p>
+    <w:p>
+      <w:r>
+        <w:t>• These are specific test cases. The liquid model is simplified, and large or out-of-band tremor can exceed the mechanism’s limits. We cannot claim 100% suppression under every condition.</w:t>
+      </w:r>
+    </w:p>
+    <w:p>
+      <w:pPr>
+        <w:pStyle w:val="Heading2"/>
+      </w:pPr>
+      <w:r>
+        <w:t>Safety</w:t>
+      </w:r>
+    </w:p>
+    <w:p>
+      <w:r>
+        <w:t>For water protection, the plan is to seal the shell joints, buttons and charging port, and use a flexible seal around the moving spoon connection. The seal must not restrict gimbal travel. The detachable food-contact spoon should be washed separately; the powered handle should not be immersed. No waterproof or IP rating has been verified.</w:t>
+      </w:r>
+    </w:p>
+    <w:p>
+      <w:r>
+        <w:t>For electrical safety, the plan is to insulate the battery, PCB and wiring from the metal spoon and moisture, add battery overcharge, over-discharge and short-circuit protection, and stop operation during charging. Low battery voltage does not mean zero leakage-current or short-circuit risk. The EMG band should operate from battery power while worn, without a wired charging connection. Leakage current, insulation and wet-condition faults still need testing.</w:t>
+      </w:r>
+    </w:p>
+    <w:p>
+      <w:r>
+        <w:t>The selected driver includes overcurrent and thermal protection, but those features do not prove the whole product is safe. We also need guarded pinch points and a tested response to sensor loss or jamming. These are prototype requirements, not completed safety features.</w:t>
       </w:r>
     </w:p>
     <w:p>
@@ -1898,7 +542,7 @@
         <w:pStyle w:val="Caption"/>
       </w:pPr>
       <w:r>
-        <w:t>Figure 2. Control architecture. Only measured or causally decoded sensor signals enter the controller; true motion intent is reserved for evaluation.</w:t>
+        <w:t>Driver protection details: https://www.ti.com/product/DRV8876</w:t>
       </w:r>
     </w:p>
     <w:p>
@@ -1906,696 +550,16 @@
         <w:pStyle w:val="Heading2"/>
       </w:pPr>
       <w:r>
-        <w:t>Baseline control sequence</w:t>
+        <w:t>Next team tasks</w:t>
       </w:r>
     </w:p>
     <w:p>
       <w:r>
-        <w:t>The handle attitude passes through fixed notch filters centred at 4, 6, 8, 10 and 12 Hz, followed by bounded phase-lead compensation and a 10 Hz low-pass filter. This produces an estimate of the slower intended movement. Frequency overlap between voluntary motion and tremor remains a fundamental ambiguity.</w:t>
-      </w:r>
-    </w:p>
-    <w:p>
-      <w:r>
-        <w:t>An 800 Hz attitude PID loop compares the measured spoon orientation with this reference. Nominal dynamics, gravity and flexure compensation reduce the feedback effort. A bounded two-actuator allocator converts the requested torque into coil-current references using the current transmission geometry. A separate 10 kHz current PI loop commands bridge voltage, with resistance and back-EMF feedforward and anti-windup.</w:t>
-      </w:r>
-    </w:p>
-    <w:p>
-      <w:r>
-        <w:t>Joint references are limited to ±14°, with a reference-rate limit of 180°/s. The plant still computes actual motion and possible overshoot. The 35 Hz attitude setting is a controller tuning parameter, not a measured hardware bandwidth. Startup assumes two seconds of stationary, level-fixture IMU calibration.</w:t>
-      </w:r>
-    </w:p>
-    <w:p>
-      <w:pPr>
-        <w:pStyle w:val="Heading2"/>
-      </w:pPr>
-      <w:r>
-        <w:t>Optional EMG wristband</w:t>
-      </w:r>
-    </w:p>
-    <w:p>
-      <w:r>
-        <w:t>The proposed forearm band supplies four differential surface-EMG channels to assist intention estimation. It senses muscle activity; it neither generates stabilising force nor stimulates the user. The current acquisition interface assumes 2 kHz sampling, causal 20–450 Hz filtering, rectification, a 4 Hz envelope and 20 ms transport delay. Filtering choices are informed by established EMG signal-quality concerns [7].</w:t>
-      </w:r>
-    </w:p>
-    <w:p>
-      <w:r>
-        <w:t>A separate labelled calibration maps opposing channel envelopes to estimated pitch and roll rates. A limited rate-dependent correction is then added to the IMU reference. Its default weight is 0.3, lead coefficient 0.12 s and angular cap ±2°. Invalid contact or clipped data cancels assistance; reconnection includes a 150 ms recovery period. EMG is disabled by default.</w:t>
-      </w:r>
-    </w:p>
-    <w:p>
-      <w:r>
-        <w:t>Current demonstrations use synthetic EMG with noise, cross-talk and tremor contamination. Electrode placement, especially for forearm roll, requires individual testing. The actual wearable electronics and electrode arrangement have not been selected, and the synthetic rate mapping does not establish physiological accuracy.</w:t>
-      </w:r>
-    </w:p>
-    <w:p>
-      <w:r>
-        <w:br w:type="page"/>
-      </w:r>
-    </w:p>
-    <w:p>
-      <w:pPr>
-        <w:pStyle w:val="Heading1"/>
-      </w:pPr>
-      <w:r>
-        <w:t>Verification and design implications</w:t>
-      </w:r>
-    </w:p>
-    <w:p>
-      <w:r>
-        <w:t>Analytical feasibility is evaluated with the same electrical and mechanical plant used for animation. Native closed-loop runs use Simulink ode23t. A faster multirate integrator supports broader testing; it is checked against a native nominal case and identified separately in reports. Twelve verification groups cover geometry, physical consistency, sensors, control, liquid behaviour and EMG interfaces [8].</w:t>
-      </w:r>
-    </w:p>
-    <w:p>
-      <w:r>
-        <w:t>Attitude suppression is the reduction in three-dimensional attitude-error RMS relative to a spoon rigidly attached to the same handle input. Steady scoring starts at 1.5 s; startup and peak errors are also reported. The baseline is a locked joint, not an unpowered freely moving gimbal. Different trial durations, payloads and noise seeds must not be treated as identical experiments.</w:t>
-      </w:r>
-    </w:p>
-    <w:tbl>
-      <w:tblPr>
-        <w:tblW w:type="auto" w:w="0"/>
-        <w:jc w:val="center"/>
-        <w:tblLayout w:type="fixed"/>
-        <w:tblLook w:firstColumn="1" w:firstRow="1" w:lastColumn="0" w:lastRow="0" w:noHBand="0" w:noVBand="1" w:val="04A0"/>
-        <w:tblBorders>
-          <w:top w:val="single" w:sz="4" w:color="D9D9D9"/>
-          <w:left w:val="single" w:sz="4" w:color="D9D9D9"/>
-          <w:bottom w:val="single" w:sz="4" w:color="D9D9D9"/>
-          <w:right w:val="single" w:sz="4" w:color="D9D9D9"/>
-          <w:insideH w:val="single" w:sz="4" w:color="D9D9D9"/>
-          <w:insideV w:val="single" w:sz="4" w:color="D9D9D9"/>
-        </w:tblBorders>
-      </w:tblPr>
-      <w:tblGrid>
-        <w:gridCol w:w="2664"/>
-        <w:gridCol w:w="3456"/>
-        <w:gridCol w:w="3456"/>
-      </w:tblGrid>
-      <w:tr>
-        <w:trPr>
-          <w:cantSplit/>
-          <w:tblHeader/>
-        </w:trPr>
-        <w:tc>
-          <w:tcPr>
-            <w:tcW w:type="dxa" w:w="2664"/>
-            <w:vAlign w:val="center"/>
-            <w:tcMar>
-              <w:top w:w="85" w:type="dxa"/>
-              <w:left w:w="85" w:type="dxa"/>
-              <w:bottom w:w="85" w:type="dxa"/>
-              <w:right w:w="85" w:type="dxa"/>
-            </w:tcMar>
-            <w:shd w:fill="343A40"/>
-          </w:tcPr>
-          <w:p>
-            <w:pPr>
-              <w:spacing w:after="20" w:line="247" w:lineRule="auto"/>
-            </w:pPr>
-            <w:r>
-              <w:rPr>
-                <w:b/>
-                <w:color w:val="FFFFFF"/>
-                <w:sz w:val="19"/>
-              </w:rPr>
-              <w:t>Test</w:t>
-            </w:r>
-          </w:p>
-        </w:tc>
-        <w:tc>
-          <w:tcPr>
-            <w:tcW w:type="dxa" w:w="3456"/>
-            <w:vAlign w:val="center"/>
-            <w:tcMar>
-              <w:top w:w="85" w:type="dxa"/>
-              <w:left w:w="85" w:type="dxa"/>
-              <w:bottom w:w="85" w:type="dxa"/>
-              <w:right w:w="85" w:type="dxa"/>
-            </w:tcMar>
-            <w:shd w:fill="343A40"/>
-          </w:tcPr>
-          <w:p>
-            <w:pPr>
-              <w:spacing w:after="20" w:line="247" w:lineRule="auto"/>
-            </w:pPr>
-            <w:r>
-              <w:rPr>
-                <w:b/>
-                <w:color w:val="FFFFFF"/>
-                <w:sz w:val="19"/>
-              </w:rPr>
-              <w:t>Computed outcome</w:t>
-            </w:r>
-          </w:p>
-        </w:tc>
-        <w:tc>
-          <w:tcPr>
-            <w:tcW w:type="dxa" w:w="3456"/>
-            <w:vAlign w:val="center"/>
-            <w:tcMar>
-              <w:top w:w="85" w:type="dxa"/>
-              <w:left w:w="85" w:type="dxa"/>
-              <w:bottom w:w="85" w:type="dxa"/>
-              <w:right w:w="85" w:type="dxa"/>
-            </w:tcMar>
-            <w:shd w:fill="343A40"/>
-          </w:tcPr>
-          <w:p>
-            <w:pPr>
-              <w:spacing w:after="20" w:line="247" w:lineRule="auto"/>
-            </w:pPr>
-            <w:r>
-              <w:rPr>
-                <w:b/>
-                <w:color w:val="FFFFFF"/>
-                <w:sz w:val="19"/>
-              </w:rPr>
-              <w:t>Design implication</w:t>
-            </w:r>
-          </w:p>
-        </w:tc>
-      </w:tr>
-      <w:tr>
-        <w:trPr>
-          <w:cantSplit/>
-        </w:trPr>
-        <w:tc>
-          <w:tcPr>
-            <w:tcW w:type="dxa" w:w="2664"/>
-            <w:vAlign w:val="center"/>
-            <w:tcMar>
-              <w:top w:w="85" w:type="dxa"/>
-              <w:left w:w="85" w:type="dxa"/>
-              <w:bottom w:w="85" w:type="dxa"/>
-              <w:right w:w="85" w:type="dxa"/>
-            </w:tcMar>
-            <w:shd w:fill="FFFFFF"/>
-          </w:tcPr>
-          <w:p>
-            <w:pPr>
-              <w:spacing w:after="20" w:line="247" w:lineRule="auto"/>
-            </w:pPr>
-            <w:r>
-              <w:rPr>
-                <w:b w:val="0"/>
-                <w:color w:val="000000"/>
-                <w:sz w:val="19"/>
-              </w:rPr>
-              <w:t>Native tremor-only</w:t>
-              <w:br/>
-              <w:t>8 Hz, 1°/axis, 5 g, 2 s</w:t>
-            </w:r>
-          </w:p>
-        </w:tc>
-        <w:tc>
-          <w:tcPr>
-            <w:tcW w:type="dxa" w:w="3456"/>
-            <w:vAlign w:val="center"/>
-            <w:tcMar>
-              <w:top w:w="85" w:type="dxa"/>
-              <w:left w:w="85" w:type="dxa"/>
-              <w:bottom w:w="85" w:type="dxa"/>
-              <w:right w:w="85" w:type="dxa"/>
-            </w:tcMar>
-            <w:shd w:fill="FFFFFF"/>
-          </w:tcPr>
-          <w:p>
-            <w:pPr>
-              <w:spacing w:after="20" w:line="247" w:lineRule="auto"/>
-            </w:pPr>
-            <w:r>
-              <w:rPr>
-                <w:b w:val="0"/>
-                <w:color w:val="000000"/>
-                <w:sz w:val="19"/>
-              </w:rPr>
-              <w:t>96.61% attitude reduction; 0.0339° RMS.</w:t>
-            </w:r>
-          </w:p>
-        </w:tc>
-        <w:tc>
-          <w:tcPr>
-            <w:tcW w:type="dxa" w:w="3456"/>
-            <w:vAlign w:val="center"/>
-            <w:tcMar>
-              <w:top w:w="85" w:type="dxa"/>
-              <w:left w:w="85" w:type="dxa"/>
-              <w:bottom w:w="85" w:type="dxa"/>
-              <w:right w:w="85" w:type="dxa"/>
-            </w:tcMar>
-            <w:shd w:fill="FFFFFF"/>
-          </w:tcPr>
-          <w:p>
-            <w:pPr>
-              <w:spacing w:after="20" w:line="247" w:lineRule="auto"/>
-            </w:pPr>
-            <w:r>
-              <w:rPr>
-                <w:b w:val="0"/>
-                <w:color w:val="000000"/>
-                <w:sz w:val="19"/>
-              </w:rPr>
-              <w:t>Supports nominal angular compensation; does not establish all-frequency performance.</w:t>
-            </w:r>
-          </w:p>
-        </w:tc>
-      </w:tr>
-      <w:tr>
-        <w:trPr>
-          <w:cantSplit/>
-        </w:trPr>
-        <w:tc>
-          <w:tcPr>
-            <w:tcW w:type="dxa" w:w="2664"/>
-            <w:vAlign w:val="center"/>
-            <w:tcMar>
-              <w:top w:w="85" w:type="dxa"/>
-              <w:left w:w="85" w:type="dxa"/>
-              <w:bottom w:w="85" w:type="dxa"/>
-              <w:right w:w="85" w:type="dxa"/>
-            </w:tcMar>
-            <w:shd w:fill="F2F4F6"/>
-          </w:tcPr>
-          <w:p>
-            <w:pPr>
-              <w:spacing w:after="20" w:line="247" w:lineRule="auto"/>
-            </w:pPr>
-            <w:r>
-              <w:rPr>
-                <w:b w:val="0"/>
-                <w:color w:val="000000"/>
-                <w:sz w:val="19"/>
-              </w:rPr>
-              <w:t>Native strong tremor</w:t>
-              <w:br/>
-              <w:t>4 Hz, 5°/axis, 8 mL, 4 s</w:t>
-            </w:r>
-          </w:p>
-        </w:tc>
-        <w:tc>
-          <w:tcPr>
-            <w:tcW w:type="dxa" w:w="3456"/>
-            <w:vAlign w:val="center"/>
-            <w:tcMar>
-              <w:top w:w="85" w:type="dxa"/>
-              <w:left w:w="85" w:type="dxa"/>
-              <w:bottom w:w="85" w:type="dxa"/>
-              <w:right w:w="85" w:type="dxa"/>
-            </w:tcMar>
-            <w:shd w:fill="F2F4F6"/>
-          </w:tcPr>
-          <w:p>
-            <w:pPr>
-              <w:spacing w:after="20" w:line="247" w:lineRule="auto"/>
-            </w:pPr>
-            <w:r>
-              <w:rPr>
-                <w:b w:val="0"/>
-                <w:color w:val="000000"/>
-                <w:sz w:val="19"/>
-              </w:rPr>
-              <w:t>92.58% attitude reduction. Estimated spill: 2.728 mL without control and 0 mL with control.</w:t>
-            </w:r>
-          </w:p>
-        </w:tc>
-        <w:tc>
-          <w:tcPr>
-            <w:tcW w:type="dxa" w:w="3456"/>
-            <w:vAlign w:val="center"/>
-            <w:tcMar>
-              <w:top w:w="85" w:type="dxa"/>
-              <w:left w:w="85" w:type="dxa"/>
-              <w:bottom w:w="85" w:type="dxa"/>
-              <w:right w:w="85" w:type="dxa"/>
-            </w:tcMar>
-            <w:shd w:fill="F2F4F6"/>
-          </w:tcPr>
-          <w:p>
-            <w:pPr>
-              <w:spacing w:after="20" w:line="247" w:lineRule="auto"/>
-            </w:pPr>
-            <w:r>
-              <w:rPr>
-                <w:b w:val="0"/>
-                <w:color w:val="000000"/>
-                <w:sz w:val="19"/>
-              </w:rPr>
-              <w:t>Shows reduced spill risk in this case; spoon-position RMS remains 4.06 mm.</w:t>
-            </w:r>
-          </w:p>
-        </w:tc>
-      </w:tr>
-      <w:tr>
-        <w:trPr>
-          <w:cantSplit/>
-        </w:trPr>
-        <w:tc>
-          <w:tcPr>
-            <w:tcW w:type="dxa" w:w="2664"/>
-            <w:vAlign w:val="center"/>
-            <w:tcMar>
-              <w:top w:w="85" w:type="dxa"/>
-              <w:left w:w="85" w:type="dxa"/>
-              <w:bottom w:w="85" w:type="dxa"/>
-              <w:right w:w="85" w:type="dxa"/>
-            </w:tcMar>
-            <w:shd w:fill="FFFFFF"/>
-          </w:tcPr>
-          <w:p>
-            <w:pPr>
-              <w:spacing w:after="20" w:line="247" w:lineRule="auto"/>
-            </w:pPr>
-            <w:r>
-              <w:rPr>
-                <w:b w:val="0"/>
-                <w:color w:val="000000"/>
-                <w:sz w:val="19"/>
-              </w:rPr>
-              <w:t>Native voluntary motion plus tremor</w:t>
-              <w:br/>
-              <w:t>8 Hz, 1°/axis, 4 s</w:t>
-            </w:r>
-          </w:p>
-        </w:tc>
-        <w:tc>
-          <w:tcPr>
-            <w:tcW w:type="dxa" w:w="3456"/>
-            <w:vAlign w:val="center"/>
-            <w:tcMar>
-              <w:top w:w="85" w:type="dxa"/>
-              <w:left w:w="85" w:type="dxa"/>
-              <w:bottom w:w="85" w:type="dxa"/>
-              <w:right w:w="85" w:type="dxa"/>
-            </w:tcMar>
-            <w:shd w:fill="FFFFFF"/>
-          </w:tcPr>
-          <w:p>
-            <w:pPr>
-              <w:spacing w:after="20" w:line="247" w:lineRule="auto"/>
-            </w:pPr>
-            <w:r>
-              <w:rPr>
-                <w:b w:val="0"/>
-                <w:color w:val="000000"/>
-                <w:sz w:val="19"/>
-              </w:rPr>
-              <w:t>EMG reduces RMS from 0.498° to 0.418°; peak current rises from 0.80 A to 1.33 A.</w:t>
-            </w:r>
-          </w:p>
-        </w:tc>
-        <w:tc>
-          <w:tcPr>
-            <w:tcW w:type="dxa" w:w="3456"/>
-            <w:vAlign w:val="center"/>
-            <w:tcMar>
-              <w:top w:w="85" w:type="dxa"/>
-              <w:left w:w="85" w:type="dxa"/>
-              <w:bottom w:w="85" w:type="dxa"/>
-              <w:right w:w="85" w:type="dxa"/>
-            </w:tcMar>
-            <w:shd w:fill="FFFFFF"/>
-          </w:tcPr>
-          <w:p>
-            <w:pPr>
-              <w:spacing w:after="20" w:line="247" w:lineRule="auto"/>
-            </w:pPr>
-            <w:r>
-              <w:rPr>
-                <w:b w:val="0"/>
-                <w:color w:val="000000"/>
-                <w:sz w:val="19"/>
-              </w:rPr>
-              <w:t>Intention assistance can help, but requires more current and real-signal calibration.</w:t>
-            </w:r>
-          </w:p>
-        </w:tc>
-      </w:tr>
-      <w:tr>
-        <w:trPr>
-          <w:cantSplit/>
-        </w:trPr>
-        <w:tc>
-          <w:tcPr>
-            <w:tcW w:type="dxa" w:w="2664"/>
-            <w:vAlign w:val="center"/>
-            <w:tcMar>
-              <w:top w:w="85" w:type="dxa"/>
-              <w:left w:w="85" w:type="dxa"/>
-              <w:bottom w:w="85" w:type="dxa"/>
-              <w:right w:w="85" w:type="dxa"/>
-            </w:tcMar>
-            <w:shd w:fill="F2F4F6"/>
-          </w:tcPr>
-          <w:p>
-            <w:pPr>
-              <w:spacing w:after="20" w:line="247" w:lineRule="auto"/>
-            </w:pPr>
-            <w:r>
-              <w:rPr>
-                <w:b w:val="0"/>
-                <w:color w:val="000000"/>
-                <w:sz w:val="19"/>
-              </w:rPr>
-              <w:t>Fast boundary tests</w:t>
-              <w:br/>
-              <w:t>20 Hz or large stepped amplitude</w:t>
-            </w:r>
-          </w:p>
-        </w:tc>
-        <w:tc>
-          <w:tcPr>
-            <w:tcW w:type="dxa" w:w="3456"/>
-            <w:vAlign w:val="center"/>
-            <w:tcMar>
-              <w:top w:w="85" w:type="dxa"/>
-              <w:left w:w="85" w:type="dxa"/>
-              <w:bottom w:w="85" w:type="dxa"/>
-              <w:right w:w="85" w:type="dxa"/>
-            </w:tcMar>
-            <w:shd w:fill="F2F4F6"/>
-          </w:tcPr>
-          <w:p>
-            <w:pPr>
-              <w:spacing w:after="20" w:line="247" w:lineRule="auto"/>
-            </w:pPr>
-            <w:r>
-              <w:rPr>
-                <w:b w:val="0"/>
-                <w:color w:val="000000"/>
-                <w:sz w:val="19"/>
-              </w:rPr>
-              <w:t>Constraints fail and motion can be amplified.</w:t>
-            </w:r>
-          </w:p>
-        </w:tc>
-        <w:tc>
-          <w:tcPr>
-            <w:tcW w:type="dxa" w:w="3456"/>
-            <w:vAlign w:val="center"/>
-            <w:tcMar>
-              <w:top w:w="85" w:type="dxa"/>
-              <w:left w:w="85" w:type="dxa"/>
-              <w:bottom w:w="85" w:type="dxa"/>
-              <w:right w:w="85" w:type="dxa"/>
-            </w:tcMar>
-            <w:shd w:fill="F2F4F6"/>
-          </w:tcPr>
-          <w:p>
-            <w:pPr>
-              <w:spacing w:after="20" w:line="247" w:lineRule="auto"/>
-            </w:pPr>
-            <w:r>
-              <w:rPr>
-                <w:b w:val="0"/>
-                <w:color w:val="000000"/>
-                <w:sz w:val="19"/>
-              </w:rPr>
-              <w:t>The operating envelope must be limited; universal 100% suppression is not supported.</w:t>
-            </w:r>
-          </w:p>
-        </w:tc>
-      </w:tr>
-    </w:tbl>
-    <w:p/>
-    <w:p>
-      <w:pPr>
-        <w:pStyle w:val="Heading2"/>
-      </w:pPr>
-      <w:r>
-        <w:t>Meaning of the liquid demonstration</w:t>
-      </w:r>
-    </w:p>
-    <w:p>
-      <w:r>
-        <w:t>Liquid is represented by two damped free-surface modes, volume conservation and a rim-overflow law. The solved spoon motion drives the liquid model, but changing liquid distribution, reaction forces and spilled mass do not feed back into the mechanical solution. It is a one-way reduced model, not CFD. For the strong-tremor case, halving grid spacing and time step changes estimated uncontrolled spill from 2.728 to 2.682 mL; controlled spill remains zero.</w:t>
-      </w:r>
-    </w:p>
-    <w:p>
-      <w:r>
-        <w:t>Numerical agreement does not validate unmeasured damping, wetting or splash physics. A no-spill animation therefore supports a testable design hypothesis rather than a guarantee that a physical spoon will remain spill-free.</w:t>
-      </w:r>
-    </w:p>
-    <w:p>
-      <w:pPr>
-        <w:pStyle w:val="Heading2"/>
-      </w:pPr>
-      <w:r>
-        <w:t>Interaction and product details</w:t>
-      </w:r>
-    </w:p>
-    <w:p>
-      <w:r>
-        <w:t>The proposed user sequence is to attach the clean spoon, power on, calibrate while stationary and begin normal eating movements. The optional band is calibrated separately. A rounded enclosure, detachable food-contact part and simple status controls support this interaction. Final materials, cleaning seals, pinch protection, fault shutdown and low-battery behaviour require explicit prototype design and testing; the current shell does not establish waterproofing or comfort.</w:t>
-      </w:r>
-    </w:p>
-    <w:p>
-      <w:r>
-        <w:br w:type="page"/>
-      </w:r>
-    </w:p>
-    <w:p>
-      <w:pPr>
-        <w:pStyle w:val="Heading1"/>
-      </w:pPr>
-      <w:r>
-        <w:t>Prototype priorities and references</w:t>
-      </w:r>
-    </w:p>
-    <w:p>
-      <w:pPr>
-        <w:pStyle w:val="Heading2"/>
-      </w:pPr>
-      <w:r>
-        <w:t>Next design decisions</w:t>
-      </w:r>
-    </w:p>
-    <w:p>
-      <w:r>
-        <w:t>The next prototype should test the most uncertain force-transmission and sensing assumptions before increasing controller complexity. First, measure the coil force–stroke relation, rod friction and extension bending under representative spoon loads. Verify the transmission geometry, flexure stress and loaded fatigue life across the required angles. These results should replace nominal assumptions in the model.</w:t>
-      </w:r>
-    </w:p>
-    <w:p>
-      <w:r>
-        <w:t>Next, build a routed control board and identify the current loops, IMU alignment, processing delays and thermal behaviour. Use a motion fixture to compare predicted and measured spoon attitude before progressing to liquid tests. Assess EMG with separate calibration and evaluation recordings, including electrode movement, co-contraction and loss of contact. Finally, evaluate grip comfort, cleaning and unintended motion with a physical prototype under an appropriate test protocol.</w:t>
-      </w:r>
-    </w:p>
-    <w:p>
-      <w:r>
-        <w:t>Candidate construction routes are a formed stainless-steel spoon, accurately machined gimbal seats and a polymer enclosure with a compliant grip surface. These are proposed manufacturing choices, not released specifications. Material compatibility, finish, fastening and tolerance drawings must be settled before fabrication.</w:t>
-      </w:r>
-    </w:p>
-    <w:p>
-      <w:pPr>
-        <w:pStyle w:val="Heading2"/>
-      </w:pPr>
-      <w:r>
-        <w:t>References and traceability</w:t>
-      </w:r>
-    </w:p>
-    <w:p>
-      <w:pPr>
-        <w:spacing w:after="140"/>
-      </w:pPr>
-      <w:r>
-        <w:rPr>
-          <w:sz w:val="18"/>
-        </w:rPr>
-        <w:t>[1] Moticont. GVCM-016-019-01M guided voice-coil motor, product specification and metric drawing. https://www.moticont.com/GVCM-016-019-01.htm</w:t>
-      </w:r>
-    </w:p>
-    <w:p>
-      <w:pPr>
-        <w:spacing w:after="140"/>
-      </w:pPr>
-      <w:r>
-        <w:rPr>
-          <w:sz w:val="18"/>
-        </w:rPr>
-        <w:t>[2] C-Flex Bearing Co. B-10 Specification Sheet. https://c-flex.com/wp-content/uploads/2025/02/B-10-SERIES-Specification-Sheet.pdf</w:t>
-      </w:r>
-    </w:p>
-    <w:p>
-      <w:pPr>
-        <w:spacing w:after="140"/>
-      </w:pPr>
-      <w:r>
-        <w:rPr>
-          <w:sz w:val="18"/>
-        </w:rPr>
-        <w:t>[3] C-Flex Bearing Co. D-10 Specification Sheet. https://c-flex.com/wp-content/uploads/2025/02/D-10-SERIES-Specification-Sheet.pdf</w:t>
-      </w:r>
-    </w:p>
-    <w:p>
-      <w:pPr>
-        <w:spacing w:after="140"/>
-      </w:pPr>
-      <w:r>
-        <w:rPr>
-          <w:sz w:val="18"/>
-        </w:rPr>
-        <w:t>[4] Texas Instruments. DRV8876 H-bridge motor driver. https://www.ti.com/product/DRV8876</w:t>
-      </w:r>
-    </w:p>
-    <w:p>
-      <w:pPr>
-        <w:spacing w:after="140"/>
-      </w:pPr>
-      <w:r>
-        <w:rPr>
-          <w:sz w:val="18"/>
-        </w:rPr>
-        <w:t>[5] Bosch Sensortec. BMI270 inertial measurement unit. https://www.bosch-sensortec.com/en/products/motion-sensors/imus/bmi270</w:t>
-      </w:r>
-    </w:p>
-    <w:p>
-      <w:pPr>
-        <w:spacing w:after="140"/>
-      </w:pPr>
-      <w:r>
-        <w:rPr>
-          <w:sz w:val="18"/>
-        </w:rPr>
-        <w:t>[6] STMicroelectronics. STM32G431CB microcontroller. https://www.st.com/en/microcontrollers-microprocessors/stm32g431cb.html</w:t>
-      </w:r>
-    </w:p>
-    <w:p>
-      <w:pPr>
-        <w:spacing w:after="140"/>
-      </w:pPr>
-      <w:r>
-        <w:rPr>
-          <w:sz w:val="18"/>
-        </w:rPr>
-        <w:t>[7] Delsys. Signal Quality Monitor guidance on movement artifacts and cross-talk. https://delsys.com/support/emgworks/signal-quality-monitor/</w:t>
-      </w:r>
-    </w:p>
-    <w:p>
-      <w:pPr>
-        <w:spacing w:after="140"/>
-      </w:pPr>
-      <w:r>
-        <w:rPr>
-          <w:sz w:val="18"/>
-        </w:rPr>
-        <w:t>[8] SensoSpoon MATLAB project. Current design parameters, hardware basis, control results, liquid model and EMG comparison; local project revision reviewed 14 September 2026. Key records: docs/DESIGN.md, docs/HARDWARE_BOM.md, output/results/CONTROL_RESULTS.md, docs/LIQUID_MODEL.md and output/results/emg_comparison.csv.</w:t>
-      </w:r>
-    </w:p>
-    <w:p>
-      <w:pPr>
-        <w:spacing w:after="140"/>
-      </w:pPr>
-      <w:r>
-        <w:rPr>
-          <w:sz w:val="18"/>
-        </w:rPr>
-        <w:t>[9] A. McDaid. Biomechatronics Project MECHENG736/730, course presentation dated 28 July 2026, pp. 5–10. Supplied file: Project Presentation- MECHENG736-730 - 2025.pdf.</w:t>
-      </w:r>
-    </w:p>
-    <w:p>
-      <w:pPr>
-        <w:pStyle w:val="Caption"/>
-      </w:pPr>
-      <w:r>
-        <w:t>Manufacturer specifications [1–7] accessed 14 September 2026. The document addresses the conceptual and detailed design elements of the R&amp;D-focused brief [9]; literature review, end-user research and the separate go-to-market plan remain separate report components.</w:t>
+        <w:t>• Finalise rod ends, shaft-extension stiffness, clearances and the quick-release connection.</w:t>
+        <w:br/>
+        <w:t>• Finish PCB routing, sealing and charging/protection circuitry.</w:t>
+        <w:br/>
+        <w:t>• Test the physical mechanism and real EMG, then check grip comfort and cleaning.</w:t>
       </w:r>
     </w:p>
     <w:sectPr>
@@ -2992,12 +956,12 @@
     <w:rsid w:val="00FC693F"/>
     <w:pPr>
       <w:widowControl/>
-      <w:spacing w:after="120" w:line="259" w:lineRule="auto"/>
+      <w:spacing w:after="120" w:line="254" w:lineRule="auto"/>
     </w:pPr>
     <w:rPr>
       <w:rFonts w:ascii="Calibri" w:hAnsi="Calibri"/>
       <w:color w:val="000000"/>
-      <w:sz w:val="21"/>
+      <w:sz w:val="22"/>
     </w:rPr>
   </w:style>
   <w:style w:type="paragraph" w:styleId="Header">
@@ -3349,7 +1313,7 @@
       <w:color w:val="000000"/>
       <w:spacing w:val="5"/>
       <w:kern w:val="28"/>
-      <w:sz w:val="48"/>
+      <w:sz w:val="44"/>
       <w:szCs w:val="52"/>
     </w:rPr>
   </w:style>

</xml_diff>

<commit_message>
Expand design reference with rationale, implementation and validation
</commit_message>
<xml_diff>
--- a/output/documents/SensoSpoon_Conceptual_and_Detailed_Design.docx
+++ b/output/documents/SensoSpoon_Conceptual_and_Detailed_Design.docx
@@ -7,7 +7,7 @@
         <w:pStyle w:val="Title"/>
       </w:pPr>
       <w:r>
-        <w:t>SensoSpoon Design Update</w:t>
+        <w:t>SensoSpoon Design Reference</w:t>
       </w:r>
     </w:p>
     <w:p>
@@ -15,12 +15,397 @@
         <w:pStyle w:val="Subtitle"/>
       </w:pPr>
       <w:r>
-        <w:t>Team sync  |  14 September 2026</w:t>
+        <w:t>Conceptual Design and Detailed Design  |  14 September 2026</w:t>
       </w:r>
     </w:p>
     <w:p>
       <w:r>
-        <w:t>This is our current spoon design: a two-axis gimbal driven by two voice coils inside the handle. Dual IMUs provide motion feedback, with an optional EMG band to help estimate intentional movement. The MATLAB model is working; the physical assembly still needs prototype testing.</w:t>
+        <w:t>SensoSpoon is a handheld eating utensil that uses active pitch and roll control to reduce tremor-related spoon motion. The current design combines a flexure gimbal, two handle-mounted voice-coil actuators, dual IMUs and optional EMG assistance. This document explains what we have selected, why we selected it and what the simulation currently supports.</w:t>
+      </w:r>
+    </w:p>
+    <w:p>
+      <w:pPr>
+        <w:pStyle w:val="Heading1"/>
+      </w:pPr>
+      <w:r>
+        <w:t>1 Conceptual Design</w:t>
+      </w:r>
+    </w:p>
+    <w:p>
+      <w:pPr>
+        <w:pStyle w:val="Heading2"/>
+      </w:pPr>
+      <w:r>
+        <w:t>The problem we are addressing</w:t>
+      </w:r>
+    </w:p>
+    <w:p>
+      <w:r>
+        <w:t>The spoon needs to remain steady enough to carry food while still following the user’s intended movement toward the mouth. Simply opposing all handle movement would also resist normal eating. The system therefore needs both an estimate of intended motion and a mechanism that can produce rapid, controlled corrections.</w:t>
+      </w:r>
+    </w:p>
+    <w:p>
+      <w:r>
+        <w:t>Our scope is two-axis angular stabilisation. Pitch raises or lowers the spoon tip; roll raises one side of the bowl and lowers the other. The initial evaluation band is 4–12 Hz. A useful nominal objective is at least 90% attitude RMS reduction in 1°-per-axis tests, while separately checking voluntary-motion tracking. These are engineering test conditions, not a claim that every user’s tremor fits this range.</w:t>
+      </w:r>
+    </w:p>
+    <w:p>
+      <w:pPr>
+        <w:pStyle w:val="Heading2"/>
+      </w:pPr>
+      <w:r>
+        <w:t>Why we selected this arrangement</w:t>
+      </w:r>
+    </w:p>
+    <w:tbl>
+      <w:tblPr>
+        <w:tblW w:type="auto" w:w="0"/>
+        <w:jc w:val="center"/>
+        <w:tblLayout w:type="fixed"/>
+        <w:tblLook w:firstColumn="1" w:firstRow="1" w:lastColumn="0" w:lastRow="0" w:noHBand="0" w:noVBand="1" w:val="04A0"/>
+        <w:tblBorders>
+          <w:top w:val="single" w:sz="4" w:color="D9D9D9"/>
+          <w:left w:val="single" w:sz="4" w:color="D9D9D9"/>
+          <w:bottom w:val="single" w:sz="4" w:color="D9D9D9"/>
+          <w:right w:val="single" w:sz="4" w:color="D9D9D9"/>
+          <w:insideH w:val="single" w:sz="4" w:color="D9D9D9"/>
+          <w:insideV w:val="single" w:sz="4" w:color="D9D9D9"/>
+        </w:tblBorders>
+      </w:tblPr>
+      <w:tblGrid>
+        <w:gridCol w:w="2736"/>
+        <w:gridCol w:w="6840"/>
+      </w:tblGrid>
+      <w:tr>
+        <w:trPr>
+          <w:cantSplit/>
+          <w:tblHeader/>
+        </w:trPr>
+        <w:tc>
+          <w:tcPr>
+            <w:tcW w:type="dxa" w:w="2736"/>
+            <w:vAlign w:val="center"/>
+            <w:tcMar>
+              <w:top w:w="85" w:type="dxa"/>
+              <w:left w:w="85" w:type="dxa"/>
+              <w:bottom w:w="85" w:type="dxa"/>
+              <w:right w:w="85" w:type="dxa"/>
+            </w:tcMar>
+            <w:shd w:fill="343A40"/>
+          </w:tcPr>
+          <w:p>
+            <w:pPr>
+              <w:spacing w:after="20" w:line="247" w:lineRule="auto"/>
+            </w:pPr>
+            <w:r>
+              <w:rPr>
+                <w:b/>
+                <w:color w:val="FFFFFF"/>
+                <w:sz w:val="19"/>
+              </w:rPr>
+              <w:t>Design choice</w:t>
+            </w:r>
+          </w:p>
+        </w:tc>
+        <w:tc>
+          <w:tcPr>
+            <w:tcW w:type="dxa" w:w="6840"/>
+            <w:vAlign w:val="center"/>
+            <w:tcMar>
+              <w:top w:w="85" w:type="dxa"/>
+              <w:left w:w="85" w:type="dxa"/>
+              <w:bottom w:w="85" w:type="dxa"/>
+              <w:right w:w="85" w:type="dxa"/>
+            </w:tcMar>
+            <w:shd w:fill="343A40"/>
+          </w:tcPr>
+          <w:p>
+            <w:pPr>
+              <w:spacing w:after="20" w:line="247" w:lineRule="auto"/>
+            </w:pPr>
+            <w:r>
+              <w:rPr>
+                <w:b/>
+                <w:color w:val="FFFFFF"/>
+                <w:sz w:val="19"/>
+              </w:rPr>
+              <w:t>Reason and tradeoff</w:t>
+            </w:r>
+          </w:p>
+        </w:tc>
+      </w:tr>
+      <w:tr>
+        <w:trPr>
+          <w:cantSplit/>
+        </w:trPr>
+        <w:tc>
+          <w:tcPr>
+            <w:tcW w:type="dxa" w:w="2736"/>
+            <w:vAlign w:val="center"/>
+            <w:tcMar>
+              <w:top w:w="85" w:type="dxa"/>
+              <w:left w:w="85" w:type="dxa"/>
+              <w:bottom w:w="85" w:type="dxa"/>
+              <w:right w:w="85" w:type="dxa"/>
+            </w:tcMar>
+            <w:shd w:fill="FFFFFF"/>
+          </w:tcPr>
+          <w:p>
+            <w:pPr>
+              <w:spacing w:after="20" w:line="247" w:lineRule="auto"/>
+            </w:pPr>
+            <w:r>
+              <w:rPr>
+                <w:b w:val="0"/>
+                <w:color w:val="000000"/>
+                <w:sz w:val="19"/>
+              </w:rPr>
+              <w:t>Active correction rather than passive weighting</w:t>
+            </w:r>
+          </w:p>
+        </w:tc>
+        <w:tc>
+          <w:tcPr>
+            <w:tcW w:type="dxa" w:w="6840"/>
+            <w:vAlign w:val="center"/>
+            <w:tcMar>
+              <w:top w:w="85" w:type="dxa"/>
+              <w:left w:w="85" w:type="dxa"/>
+              <w:bottom w:w="85" w:type="dxa"/>
+              <w:right w:w="85" w:type="dxa"/>
+            </w:tcMar>
+            <w:shd w:fill="FFFFFF"/>
+          </w:tcPr>
+          <w:p>
+            <w:pPr>
+              <w:spacing w:after="20" w:line="247" w:lineRule="auto"/>
+            </w:pPr>
+            <w:r>
+              <w:rPr>
+                <w:b w:val="0"/>
+                <w:color w:val="000000"/>
+                <w:sz w:val="19"/>
+              </w:rPr>
+              <w:t>Allows the spoon attitude to be regulated from sensor feedback. This adds power, sensing and control requirements.</w:t>
+            </w:r>
+          </w:p>
+        </w:tc>
+      </w:tr>
+      <w:tr>
+        <w:trPr>
+          <w:cantSplit/>
+        </w:trPr>
+        <w:tc>
+          <w:tcPr>
+            <w:tcW w:type="dxa" w:w="2736"/>
+            <w:vAlign w:val="center"/>
+            <w:tcMar>
+              <w:top w:w="85" w:type="dxa"/>
+              <w:left w:w="85" w:type="dxa"/>
+              <w:bottom w:w="85" w:type="dxa"/>
+              <w:right w:w="85" w:type="dxa"/>
+            </w:tcMar>
+            <w:shd w:fill="F2F4F6"/>
+          </w:tcPr>
+          <w:p>
+            <w:pPr>
+              <w:spacing w:after="20" w:line="247" w:lineRule="auto"/>
+            </w:pPr>
+            <w:r>
+              <w:rPr>
+                <w:b w:val="0"/>
+                <w:color w:val="000000"/>
+                <w:sz w:val="19"/>
+              </w:rPr>
+              <w:t>Voice coils fixed inside the handle</w:t>
+            </w:r>
+          </w:p>
+        </w:tc>
+        <w:tc>
+          <w:tcPr>
+            <w:tcW w:type="dxa" w:w="6840"/>
+            <w:vAlign w:val="center"/>
+            <w:tcMar>
+              <w:top w:w="85" w:type="dxa"/>
+              <w:left w:w="85" w:type="dxa"/>
+              <w:bottom w:w="85" w:type="dxa"/>
+              <w:right w:w="85" w:type="dxa"/>
+            </w:tcMar>
+            <w:shd w:fill="F2F4F6"/>
+          </w:tcPr>
+          <w:p>
+            <w:pPr>
+              <w:spacing w:after="20" w:line="247" w:lineRule="auto"/>
+            </w:pPr>
+            <w:r>
+              <w:rPr>
+                <w:b w:val="0"/>
+                <w:color w:val="000000"/>
+                <w:sz w:val="19"/>
+              </w:rPr>
+              <w:t>Provide bidirectional linear force without a geared rotary transmission. Their movers and rods still add inertia, and travel is limited.</w:t>
+            </w:r>
+          </w:p>
+        </w:tc>
+      </w:tr>
+      <w:tr>
+        <w:trPr>
+          <w:cantSplit/>
+        </w:trPr>
+        <w:tc>
+          <w:tcPr>
+            <w:tcW w:type="dxa" w:w="2736"/>
+            <w:vAlign w:val="center"/>
+            <w:tcMar>
+              <w:top w:w="85" w:type="dxa"/>
+              <w:left w:w="85" w:type="dxa"/>
+              <w:bottom w:w="85" w:type="dxa"/>
+              <w:right w:w="85" w:type="dxa"/>
+            </w:tcMar>
+            <w:shd w:fill="FFFFFF"/>
+          </w:tcPr>
+          <w:p>
+            <w:pPr>
+              <w:spacing w:after="20" w:line="247" w:lineRule="auto"/>
+            </w:pPr>
+            <w:r>
+              <w:rPr>
+                <w:b w:val="0"/>
+                <w:color w:val="000000"/>
+                <w:sz w:val="19"/>
+              </w:rPr>
+              <w:t>Flexure gimbal with direct pushrods</w:t>
+            </w:r>
+          </w:p>
+        </w:tc>
+        <w:tc>
+          <w:tcPr>
+            <w:tcW w:type="dxa" w:w="6840"/>
+            <w:vAlign w:val="center"/>
+            <w:tcMar>
+              <w:top w:w="85" w:type="dxa"/>
+              <w:left w:w="85" w:type="dxa"/>
+              <w:bottom w:w="85" w:type="dxa"/>
+              <w:right w:w="85" w:type="dxa"/>
+            </w:tcMar>
+            <w:shd w:fill="FFFFFF"/>
+          </w:tcPr>
+          <w:p>
+            <w:pPr>
+              <w:spacing w:after="20" w:line="247" w:lineRule="auto"/>
+            </w:pPr>
+            <w:r>
+              <w:rPr>
+                <w:b w:val="0"/>
+                <w:color w:val="000000"/>
+                <w:sz w:val="19"/>
+              </w:rPr>
+              <w:t>Provides low-backlash rotational support and avoids a bellcrank. Restoring stiffness, rod angles and coupled torques must be included in control.</w:t>
+            </w:r>
+          </w:p>
+        </w:tc>
+      </w:tr>
+      <w:tr>
+        <w:trPr>
+          <w:cantSplit/>
+        </w:trPr>
+        <w:tc>
+          <w:tcPr>
+            <w:tcW w:type="dxa" w:w="2736"/>
+            <w:vAlign w:val="center"/>
+            <w:tcMar>
+              <w:top w:w="85" w:type="dxa"/>
+              <w:left w:w="85" w:type="dxa"/>
+              <w:bottom w:w="85" w:type="dxa"/>
+              <w:right w:w="85" w:type="dxa"/>
+            </w:tcMar>
+            <w:shd w:fill="F2F4F6"/>
+          </w:tcPr>
+          <w:p>
+            <w:pPr>
+              <w:spacing w:after="20" w:line="247" w:lineRule="auto"/>
+            </w:pPr>
+            <w:r>
+              <w:rPr>
+                <w:b w:val="0"/>
+                <w:color w:val="000000"/>
+                <w:sz w:val="19"/>
+              </w:rPr>
+              <w:t>Dual IMUs with optional EMG</w:t>
+            </w:r>
+          </w:p>
+        </w:tc>
+        <w:tc>
+          <w:tcPr>
+            <w:tcW w:type="dxa" w:w="6840"/>
+            <w:vAlign w:val="center"/>
+            <w:tcMar>
+              <w:top w:w="85" w:type="dxa"/>
+              <w:left w:w="85" w:type="dxa"/>
+              <w:bottom w:w="85" w:type="dxa"/>
+              <w:right w:w="85" w:type="dxa"/>
+            </w:tcMar>
+            <w:shd w:fill="F2F4F6"/>
+          </w:tcPr>
+          <w:p>
+            <w:pPr>
+              <w:spacing w:after="20" w:line="247" w:lineRule="auto"/>
+            </w:pPr>
+            <w:r>
+              <w:rPr>
+                <w:b w:val="0"/>
+                <w:color w:val="000000"/>
+                <w:sz w:val="19"/>
+              </w:rPr>
+              <w:t>IMUs measure actual motion; EMG can add information about muscle activation. EMG needs individual calibration and may contain tremor and noise.</w:t>
+            </w:r>
+          </w:p>
+        </w:tc>
+      </w:tr>
+    </w:tbl>
+    <w:p/>
+    <w:p>
+      <w:pPr>
+        <w:pStyle w:val="Heading2"/>
+      </w:pPr>
+      <w:r>
+        <w:t>How the system works as a whole</w:t>
+      </w:r>
+    </w:p>
+    <w:p>
+      <w:r>
+        <w:t>The handle IMU measures incoming motion, while the spoon IMU measures the resulting bowl motion. The controller estimates the motion that should be preserved and commands the two coils to reduce the remaining attitude error. The user still decides the eating path; the spoon does not autonomously plan a route to the mouth.</w:t>
+      </w:r>
+    </w:p>
+    <w:p>
+      <w:r>
+        <w:t>The handle contains the fixed electronics and actuator housings. The detachable spoon is carried by a custom two-axis mechanism inside a spherical front cover. This keeps the overall form close to an ordinary powered utensil, although grip comfort and cleaning still need physical testing. The combined architecture is the proposed design contribution; novelty requires comparison with the literature, rather than a claim based only on the appearance.</w:t>
+      </w:r>
+    </w:p>
+    <w:p>
+      <w:r>
+        <w:br w:type="page"/>
+      </w:r>
+    </w:p>
+    <w:p>
+      <w:pPr>
+        <w:pStyle w:val="Heading1"/>
+      </w:pPr>
+      <w:r>
+        <w:t>2 Detailed Design</w:t>
+      </w:r>
+    </w:p>
+    <w:p>
+      <w:pPr>
+        <w:pStyle w:val="Heading2"/>
+      </w:pPr>
+      <w:r>
+        <w:t>Mechanical layout</w:t>
+      </w:r>
+    </w:p>
+    <w:p>
+      <w:r>
+        <w:t>Two C-Flex B-10 flexure pivots support pitch, and one D-10 pivot supports roll. The spherical moving carrier follows these constrained axes; it is not a free ball-and-socket bearing. The pivots are catalogue components, while the carrier, frames, rod ends, quick release and enclosure are custom parts.</w:t>
       </w:r>
     </w:p>
     <w:p>
@@ -67,7 +452,7 @@
         <w:pStyle w:val="Caption"/>
       </w:pPr>
       <w:r>
-        <w:t>Current MATLAB model: assembled view and internal layout. These are simulation renders.</w:t>
+        <w:t>Figure 1. Current MATLAB geometry: assembled view and cutaway. These are model renders, not prototype photographs.</w:t>
       </w:r>
     </w:p>
     <w:p>
@@ -75,20 +460,22 @@
         <w:pStyle w:val="Heading2"/>
       </w:pPr>
       <w:r>
-        <w:t>Conceptual design</w:t>
+        <w:t>How the coils create pitch and roll</w:t>
       </w:r>
     </w:p>
     <w:p>
       <w:r>
-        <w:t>The aim is to keep the bowl steady while allowing the user to lift and move the spoon naturally. We chose handle-mounted voice coils and flexure pivots for reversible force control and low backlash. The spherical front cover hides a constrained pitch-and-roll mechanism, not a freely rotating ball joint.</w:t>
+        <w:t>The selected Moticont GVCM-016-019-01M is a guided linear voice-coil motor. Current produces force in one direction; reversing current reverses that force. Its housing stays fixed, while the moving assembly drives a pushrod. Each actuator has 12.7 mm total travel, 1.5 N continuous force and 4.6 N intermittent force at 10% duty. The intermittent value is not continuous operating authority.</w:t>
       </w:r>
     </w:p>
     <w:p>
-      <w:pPr>
-        <w:pStyle w:val="Heading2"/>
-      </w:pPr>
       <w:r>
-        <w:t>Detailed design</w:t>
+        <w:t>Both rods contribute to both axes. Pitch comes from moments about the transverse axis. Roll comes from transverse force components acting at offset attachment points around the spoon’s lengthwise axis. Offset alone is not enough if the applied force is exactly parallel to that axis. The rods can be straight, but their installed directions must be inclined; they do not need a right-angle bend.</w:t>
+      </w:r>
+    </w:p>
+    <w:p>
+      <w:r>
+        <w:t>The linkage geometry changes with joint angle. The model solves the fixed rod lengths to obtain actuator displacement and uses the transmission Jacobian to map rod forces into pitch and roll torque. This is why the controller coordinates both coils rather than treating them as independent pitch and roll motors.</w:t>
       </w:r>
     </w:p>
     <w:tbl>
@@ -107,8 +494,8 @@
         </w:tblBorders>
       </w:tblPr>
       <w:tblGrid>
-        <w:gridCol w:w="1800"/>
-        <w:gridCol w:w="7776"/>
+        <w:gridCol w:w="2088"/>
+        <w:gridCol w:w="7488"/>
       </w:tblGrid>
       <w:tr>
         <w:trPr>
@@ -117,7 +504,7 @@
         </w:trPr>
         <w:tc>
           <w:tcPr>
-            <w:tcW w:type="dxa" w:w="1800"/>
+            <w:tcW w:type="dxa" w:w="2088"/>
             <w:vAlign w:val="center"/>
             <w:tcMar>
               <w:top w:w="85" w:type="dxa"/>
@@ -137,13 +524,13 @@
                 <w:color w:val="FFFFFF"/>
                 <w:sz w:val="19"/>
               </w:rPr>
-              <w:t>Part</w:t>
+              <w:t>Feature</w:t>
             </w:r>
           </w:p>
         </w:tc>
         <w:tc>
           <w:tcPr>
-            <w:tcW w:type="dxa" w:w="7776"/>
+            <w:tcW w:type="dxa" w:w="7488"/>
             <w:vAlign w:val="center"/>
             <w:tcMar>
               <w:top w:w="85" w:type="dxa"/>
@@ -163,7 +550,7 @@
                 <w:color w:val="FFFFFF"/>
                 <w:sz w:val="19"/>
               </w:rPr>
-              <w:t>Current choice</w:t>
+              <w:t>Current value</w:t>
             </w:r>
           </w:p>
         </w:tc>
@@ -174,7 +561,7 @@
         </w:trPr>
         <w:tc>
           <w:tcPr>
-            <w:tcW w:type="dxa" w:w="1800"/>
+            <w:tcW w:type="dxa" w:w="2088"/>
             <w:vAlign w:val="center"/>
             <w:tcMar>
               <w:top w:w="85" w:type="dxa"/>
@@ -194,13 +581,13 @@
                 <w:color w:val="000000"/>
                 <w:sz w:val="19"/>
               </w:rPr>
-              <w:t>Actuation</w:t>
+              <w:t>Spoon and neck</w:t>
             </w:r>
           </w:p>
         </w:tc>
         <w:tc>
           <w:tcPr>
-            <w:tcW w:type="dxa" w:w="7776"/>
+            <w:tcW w:type="dxa" w:w="7488"/>
             <w:vAlign w:val="center"/>
             <w:tcMar>
               <w:top w:w="85" w:type="dxa"/>
@@ -220,7 +607,7 @@
                 <w:color w:val="000000"/>
                 <w:sz w:val="19"/>
               </w:rPr>
-              <w:t>2 × Moticont GVCM-016-019-01M voice coils; 12.7 mm total stroke. Housings fixed to the handle.</w:t>
+              <w:t>62 × 40 × 12 mm bowl; 31 mm curved neck; 1.2 mm rim and 1.8 mm bottom thickness.</w:t>
             </w:r>
           </w:p>
         </w:tc>
@@ -231,7 +618,7 @@
         </w:trPr>
         <w:tc>
           <w:tcPr>
-            <w:tcW w:type="dxa" w:w="1800"/>
+            <w:tcW w:type="dxa" w:w="2088"/>
             <w:vAlign w:val="center"/>
             <w:tcMar>
               <w:top w:w="85" w:type="dxa"/>
@@ -251,13 +638,13 @@
                 <w:color w:val="000000"/>
                 <w:sz w:val="19"/>
               </w:rPr>
-              <w:t>Gimbal</w:t>
+              <w:t>Packaging</w:t>
             </w:r>
           </w:p>
         </w:tc>
         <w:tc>
           <w:tcPr>
-            <w:tcW w:type="dxa" w:w="7776"/>
+            <w:tcW w:type="dxa" w:w="7488"/>
             <w:vAlign w:val="center"/>
             <w:tcMar>
               <w:top w:w="85" w:type="dxa"/>
@@ -277,7 +664,7 @@
                 <w:color w:val="000000"/>
                 <w:sz w:val="19"/>
               </w:rPr>
-              <w:t>2 × C-Flex B-10 pitch pivots and 1 × D-10 roll pivot; custom carrier, mounts and rod ends.</w:t>
+              <w:t>271 mm overall; typical grip sections approximately 33 × 28 to 34.4 × 30 mm.</w:t>
             </w:r>
           </w:p>
         </w:tc>
@@ -288,7 +675,7 @@
         </w:trPr>
         <w:tc>
           <w:tcPr>
-            <w:tcW w:type="dxa" w:w="1800"/>
+            <w:tcW w:type="dxa" w:w="2088"/>
             <w:vAlign w:val="center"/>
             <w:tcMar>
               <w:top w:w="85" w:type="dxa"/>
@@ -308,13 +695,13 @@
                 <w:color w:val="000000"/>
                 <w:sz w:val="19"/>
               </w:rPr>
-              <w:t>Transmission</w:t>
+              <w:t>Gimbal and travel</w:t>
             </w:r>
           </w:p>
         </w:tc>
         <w:tc>
           <w:tcPr>
-            <w:tcW w:type="dxa" w:w="7776"/>
+            <w:tcW w:type="dxa" w:w="7488"/>
             <w:vAlign w:val="center"/>
             <w:tcMar>
               <w:top w:w="85" w:type="dxa"/>
@@ -334,7 +721,7 @@
                 <w:color w:val="000000"/>
                 <w:sz w:val="19"/>
               </w:rPr>
-              <w:t>Two straight but inclined pushrods. Staggered actuators keep the grip narrower; the rear unit has a shaft extension.</w:t>
+              <w:t>42 mm maximum front-bezel diameter; 34 mm moving carrier; modelled joint stops at ±15°.</w:t>
             </w:r>
           </w:p>
         </w:tc>
@@ -345,7 +732,7 @@
         </w:trPr>
         <w:tc>
           <w:tcPr>
-            <w:tcW w:type="dxa" w:w="1800"/>
+            <w:tcW w:type="dxa" w:w="2088"/>
             <w:vAlign w:val="center"/>
             <w:tcMar>
               <w:top w:w="85" w:type="dxa"/>
@@ -365,13 +752,13 @@
                 <w:color w:val="000000"/>
                 <w:sz w:val="19"/>
               </w:rPr>
-              <w:t>Electronics</w:t>
+              <w:t>Actuator layout</w:t>
             </w:r>
           </w:p>
         </w:tc>
         <w:tc>
           <w:tcPr>
-            <w:tcW w:type="dxa" w:w="7776"/>
+            <w:tcW w:type="dxa" w:w="7488"/>
             <w:vAlign w:val="center"/>
             <w:tcMar>
               <w:top w:w="85" w:type="dxa"/>
@@ -391,7 +778,104 @@
                 <w:color w:val="000000"/>
                 <w:sz w:val="19"/>
               </w:rPr>
-              <w:t>2 × BMI270 IMUs, 2 × DRV8876 drivers and an STM32G431CBT6 MCU. Main PCB layout is not finished.</w:t>
+              <w:t>Two staggered 15.9 mm diameter actuators; rear unit uses a 32 mm long, 3 mm diameter extension.</w:t>
+            </w:r>
+          </w:p>
+        </w:tc>
+      </w:tr>
+    </w:tbl>
+    <w:p/>
+    <w:p>
+      <w:r>
+        <w:t>Staggering trades additional length for a narrower grip. The extension has about 0.55 mm nominal clearance past the front actuator, but tolerances, bending and fatigue are not yet verified. The C-Flex ±15° indefinite-life statement is conditional on zero load. Loaded life still needs checking. The current joint centre is an equivalent local centre, not a verified remote centre of motion.</w:t>
+      </w:r>
+    </w:p>
+    <w:p>
+      <w:r>
+        <w:br w:type="page"/>
+      </w:r>
+    </w:p>
+    <w:p>
+      <w:pPr>
+        <w:pStyle w:val="Heading1"/>
+      </w:pPr>
+      <w:r>
+        <w:t>Electronics and motion control</w:t>
+      </w:r>
+    </w:p>
+    <w:tbl>
+      <w:tblPr>
+        <w:tblW w:type="auto" w:w="0"/>
+        <w:jc w:val="center"/>
+        <w:tblLayout w:type="fixed"/>
+        <w:tblLook w:firstColumn="1" w:firstRow="1" w:lastColumn="0" w:lastRow="0" w:noHBand="0" w:noVBand="1" w:val="04A0"/>
+        <w:tblBorders>
+          <w:top w:val="single" w:sz="4" w:color="D9D9D9"/>
+          <w:left w:val="single" w:sz="4" w:color="D9D9D9"/>
+          <w:bottom w:val="single" w:sz="4" w:color="D9D9D9"/>
+          <w:right w:val="single" w:sz="4" w:color="D9D9D9"/>
+          <w:insideH w:val="single" w:sz="4" w:color="D9D9D9"/>
+          <w:insideV w:val="single" w:sz="4" w:color="D9D9D9"/>
+        </w:tblBorders>
+      </w:tblPr>
+      <w:tblGrid>
+        <w:gridCol w:w="2304"/>
+        <w:gridCol w:w="7272"/>
+      </w:tblGrid>
+      <w:tr>
+        <w:trPr>
+          <w:cantSplit/>
+          <w:tblHeader/>
+        </w:trPr>
+        <w:tc>
+          <w:tcPr>
+            <w:tcW w:type="dxa" w:w="2304"/>
+            <w:vAlign w:val="center"/>
+            <w:tcMar>
+              <w:top w:w="85" w:type="dxa"/>
+              <w:left w:w="85" w:type="dxa"/>
+              <w:bottom w:w="85" w:type="dxa"/>
+              <w:right w:w="85" w:type="dxa"/>
+            </w:tcMar>
+            <w:shd w:fill="343A40"/>
+          </w:tcPr>
+          <w:p>
+            <w:pPr>
+              <w:spacing w:after="20" w:line="247" w:lineRule="auto"/>
+            </w:pPr>
+            <w:r>
+              <w:rPr>
+                <w:b/>
+                <w:color w:val="FFFFFF"/>
+                <w:sz w:val="19"/>
+              </w:rPr>
+              <w:t>Part or setting</w:t>
+            </w:r>
+          </w:p>
+        </w:tc>
+        <w:tc>
+          <w:tcPr>
+            <w:tcW w:type="dxa" w:w="7272"/>
+            <w:vAlign w:val="center"/>
+            <w:tcMar>
+              <w:top w:w="85" w:type="dxa"/>
+              <w:left w:w="85" w:type="dxa"/>
+              <w:bottom w:w="85" w:type="dxa"/>
+              <w:right w:w="85" w:type="dxa"/>
+            </w:tcMar>
+            <w:shd w:fill="343A40"/>
+          </w:tcPr>
+          <w:p>
+            <w:pPr>
+              <w:spacing w:after="20" w:line="247" w:lineRule="auto"/>
+            </w:pPr>
+            <w:r>
+              <w:rPr>
+                <w:b/>
+                <w:color w:val="FFFFFF"/>
+                <w:sz w:val="19"/>
+              </w:rPr>
+              <w:t>Current implementation</w:t>
             </w:r>
           </w:p>
         </w:tc>
@@ -402,7 +886,7 @@
         </w:trPr>
         <w:tc>
           <w:tcPr>
-            <w:tcW w:type="dxa" w:w="1800"/>
+            <w:tcW w:type="dxa" w:w="2304"/>
             <w:vAlign w:val="center"/>
             <w:tcMar>
               <w:top w:w="85" w:type="dxa"/>
@@ -422,13 +906,13 @@
                 <w:color w:val="000000"/>
                 <w:sz w:val="19"/>
               </w:rPr>
-              <w:t>Size and power</w:t>
+              <w:t>Motion sensing</w:t>
             </w:r>
           </w:p>
         </w:tc>
         <w:tc>
           <w:tcPr>
-            <w:tcW w:type="dxa" w:w="7776"/>
+            <w:tcW w:type="dxa" w:w="7272"/>
             <w:vAlign w:val="center"/>
             <w:tcMar>
               <w:top w:w="85" w:type="dxa"/>
@@ -448,7 +932,178 @@
                 <w:color w:val="000000"/>
                 <w:sz w:val="19"/>
               </w:rPr>
-              <w:t>271 mm overall; bowl 62 × 40 × 12 mm; 31 mm curved neck; model supply 7.4 V, 400 mAh.</w:t>
+              <w:t>2 × Bosch BMI270; one on the handle and one on the spoon carrier. Model sampling: 800 Hz, ±500°/s and ±8 g.</w:t>
+            </w:r>
+          </w:p>
+        </w:tc>
+      </w:tr>
+      <w:tr>
+        <w:trPr>
+          <w:cantSplit/>
+        </w:trPr>
+        <w:tc>
+          <w:tcPr>
+            <w:tcW w:type="dxa" w:w="2304"/>
+            <w:vAlign w:val="center"/>
+            <w:tcMar>
+              <w:top w:w="85" w:type="dxa"/>
+              <w:left w:w="85" w:type="dxa"/>
+              <w:bottom w:w="85" w:type="dxa"/>
+              <w:right w:w="85" w:type="dxa"/>
+            </w:tcMar>
+            <w:shd w:fill="F2F4F6"/>
+          </w:tcPr>
+          <w:p>
+            <w:pPr>
+              <w:spacing w:after="20" w:line="247" w:lineRule="auto"/>
+            </w:pPr>
+            <w:r>
+              <w:rPr>
+                <w:b w:val="0"/>
+                <w:color w:val="000000"/>
+                <w:sz w:val="19"/>
+              </w:rPr>
+              <w:t>Drivers and controller</w:t>
+            </w:r>
+          </w:p>
+        </w:tc>
+        <w:tc>
+          <w:tcPr>
+            <w:tcW w:type="dxa" w:w="7272"/>
+            <w:vAlign w:val="center"/>
+            <w:tcMar>
+              <w:top w:w="85" w:type="dxa"/>
+              <w:left w:w="85" w:type="dxa"/>
+              <w:bottom w:w="85" w:type="dxa"/>
+              <w:right w:w="85" w:type="dxa"/>
+            </w:tcMar>
+            <w:shd w:fill="F2F4F6"/>
+          </w:tcPr>
+          <w:p>
+            <w:pPr>
+              <w:spacing w:after="20" w:line="247" w:lineRule="auto"/>
+            </w:pPr>
+            <w:r>
+              <w:rPr>
+                <w:b w:val="0"/>
+                <w:color w:val="000000"/>
+                <w:sz w:val="19"/>
+              </w:rPr>
+              <w:t>2 × TI DRV8876PWPR; STM32G431CBT6 MCU selected. Main PCB target 45 × 16 mm; routing and firmware timing remain unfinished.</w:t>
+            </w:r>
+          </w:p>
+        </w:tc>
+      </w:tr>
+      <w:tr>
+        <w:trPr>
+          <w:cantSplit/>
+        </w:trPr>
+        <w:tc>
+          <w:tcPr>
+            <w:tcW w:type="dxa" w:w="2304"/>
+            <w:vAlign w:val="center"/>
+            <w:tcMar>
+              <w:top w:w="85" w:type="dxa"/>
+              <w:left w:w="85" w:type="dxa"/>
+              <w:bottom w:w="85" w:type="dxa"/>
+              <w:right w:w="85" w:type="dxa"/>
+            </w:tcMar>
+            <w:shd w:fill="FFFFFF"/>
+          </w:tcPr>
+          <w:p>
+            <w:pPr>
+              <w:spacing w:after="20" w:line="247" w:lineRule="auto"/>
+            </w:pPr>
+            <w:r>
+              <w:rPr>
+                <w:b w:val="0"/>
+                <w:color w:val="000000"/>
+                <w:sz w:val="19"/>
+              </w:rPr>
+              <w:t>Power and limits</w:t>
+            </w:r>
+          </w:p>
+        </w:tc>
+        <w:tc>
+          <w:tcPr>
+            <w:tcW w:type="dxa" w:w="7272"/>
+            <w:vAlign w:val="center"/>
+            <w:tcMar>
+              <w:top w:w="85" w:type="dxa"/>
+              <w:left w:w="85" w:type="dxa"/>
+              <w:bottom w:w="85" w:type="dxa"/>
+              <w:right w:w="85" w:type="dxa"/>
+            </w:tcMar>
+            <w:shd w:fill="FFFFFF"/>
+          </w:tcPr>
+          <w:p>
+            <w:pPr>
+              <w:spacing w:after="20" w:line="247" w:lineRule="auto"/>
+            </w:pPr>
+            <w:r>
+              <w:rPr>
+                <w:b w:val="0"/>
+                <w:color w:val="000000"/>
+                <w:sz w:val="19"/>
+              </w:rPr>
+              <w:t>7.4 V, 400 mAh model supply; 1.5 A design current limit; actuator stroke ±6.35 mm; commanded relative joint angle ±14°.</w:t>
+            </w:r>
+          </w:p>
+        </w:tc>
+      </w:tr>
+      <w:tr>
+        <w:trPr>
+          <w:cantSplit/>
+        </w:trPr>
+        <w:tc>
+          <w:tcPr>
+            <w:tcW w:type="dxa" w:w="2304"/>
+            <w:vAlign w:val="center"/>
+            <w:tcMar>
+              <w:top w:w="85" w:type="dxa"/>
+              <w:left w:w="85" w:type="dxa"/>
+              <w:bottom w:w="85" w:type="dxa"/>
+              <w:right w:w="85" w:type="dxa"/>
+            </w:tcMar>
+            <w:shd w:fill="F2F4F6"/>
+          </w:tcPr>
+          <w:p>
+            <w:pPr>
+              <w:spacing w:after="20" w:line="247" w:lineRule="auto"/>
+            </w:pPr>
+            <w:r>
+              <w:rPr>
+                <w:b w:val="0"/>
+                <w:color w:val="000000"/>
+                <w:sz w:val="19"/>
+              </w:rPr>
+              <w:t>Coil model</w:t>
+            </w:r>
+          </w:p>
+        </w:tc>
+        <w:tc>
+          <w:tcPr>
+            <w:tcW w:type="dxa" w:w="7272"/>
+            <w:vAlign w:val="center"/>
+            <w:tcMar>
+              <w:top w:w="85" w:type="dxa"/>
+              <w:left w:w="85" w:type="dxa"/>
+              <w:bottom w:w="85" w:type="dxa"/>
+              <w:right w:w="85" w:type="dxa"/>
+            </w:tcMar>
+            <w:shd w:fill="F2F4F6"/>
+          </w:tcPr>
+          <w:p>
+            <w:pPr>
+              <w:spacing w:after="20" w:line="247" w:lineRule="auto"/>
+            </w:pPr>
+            <w:r>
+              <w:rPr>
+                <w:b w:val="0"/>
+                <w:color w:val="000000"/>
+                <w:sz w:val="19"/>
+              </w:rPr>
+              <w:t>4.6 Ω resistance, 0.8 mH inductance and nominal force constant 1.5 N/A; back-EMF, driver resistance and temperature are included.</w:t>
             </w:r>
           </w:p>
         </w:tc>
@@ -460,12 +1115,58 @@
         <w:pStyle w:val="Heading2"/>
       </w:pPr>
       <w:r>
-        <w:t>How pitch and roll work</w:t>
+        <w:t>The baseline control loop</w:t>
       </w:r>
     </w:p>
     <w:p>
       <w:r>
-        <w:t>Pitch moves the tip up and down. Roll lifts one side of the bowl while lowering the other. Both coils work together for both axes. Roll torque comes from offset attachment points and transverse pushrod forces: offset alone is not enough if the force is exactly parallel to the spoon’s length. No right-angle rod bend is needed.</w:t>
+        <w:t>The IMUs provide angular rate and acceleration with modelled bias, noise, quantisation, filtering and delay. Gyroscope integration is corrected slowly using acceleration. Startup assumes two seconds of calibration in a stationary, level fixture; operation from an arbitrary uncalibrated pose is not established.</w:t>
+      </w:r>
+    </w:p>
+    <w:p>
+      <w:r>
+        <w:t>A fixed filter chain removes selected tremor-frequency components from the handle attitude to estimate intended movement. It uses notches at 4, 6, 8, 10 and 12 Hz, phase-lead compensation and a 10 Hz low-pass filter. Voluntary motion and tremor can overlap in frequency, so this estimate is imperfect.</w:t>
+      </w:r>
+    </w:p>
+    <w:p>
+      <w:r>
+        <w:t>An 800 Hz attitude PID loop calculates corrective torque, with nominal gravity, flexure and dynamic compensation. A bounded allocator maps torque to the two coil-current references. A 10 kHz current PI loop then commands bridge voltage. Anti-windup and current allocation limit excessive commands; estimated copper loss and shaft side load also constrain the allocation. The 35 Hz attitude tuning setting is not a measured hardware bandwidth.</w:t>
+      </w:r>
+    </w:p>
+    <w:p>
+      <w:pPr>
+        <w:pStyle w:val="Heading2"/>
+      </w:pPr>
+      <w:r>
+        <w:t>What EMG adds</w:t>
+      </w:r>
+    </w:p>
+    <w:p>
+      <w:r>
+        <w:t>The optional wristband measures forearm muscle activity to help distinguish intended movement from unwanted motion. It is a sensor, not a wrist actuator or electrical stimulator. Four differential channels are sampled at an assumed 2 kHz, filtered causally at 20–450 Hz, rectified and smoothed into a 4 Hz envelope. The simulated transport delay is 20 ms.</w:t>
+      </w:r>
+    </w:p>
+    <w:p>
+      <w:r>
+        <w:t>A separate labelled calibration maps opposing channel envelopes into pitch and roll rate estimates. The controller adds a small rate-based correction to the IMU reference, capped at ±2°. EMG is disabled by default. Invalid contact or clipped measurements remove its contribution; reconnecting requires a 150 ms recovery period.</w:t>
+      </w:r>
+    </w:p>
+    <w:p>
+      <w:r>
+        <w:t>The present trials use synthetic EMG with noise, cross-talk and tremor contamination. Actual electrode placement, especially for forearm roll, and cross-session calibration remain open tasks. The interface accepts recorded EMG, but the wearable electronics and radio are not yet selected.</w:t>
+      </w:r>
+    </w:p>
+    <w:p>
+      <w:pPr>
+        <w:pStyle w:val="Heading2"/>
+      </w:pPr>
+      <w:r>
+        <w:t>What is actually simulated</w:t>
+      </w:r>
+    </w:p>
+    <w:p>
+      <w:r>
+        <w:t>The native Simulink model solves joint angles, velocities, coil currents and temperature rises. Gravity, base motion, moving inertia, flexure stiffness, friction and compliant stops affect the result. Animation follows the solved states. Thermal behaviour, some friction and custom-part properties still use assumptions; the model is an analytical development platform rather than a calibrated physical prototype.</w:t>
       </w:r>
     </w:p>
     <w:p>
@@ -478,17 +1179,7 @@
         <w:pStyle w:val="Heading1"/>
       </w:pPr>
       <w:r>
-        <w:t>Control and EMG</w:t>
-      </w:r>
-    </w:p>
-    <w:p>
-      <w:r>
-        <w:t>The two IMUs measure handle and spoon motion. An 800 Hz attitude controller estimates the intended movement and requests compensating torque; a 10 kHz current controller drives the coils. Commanded relative angles are limited to ±14°, with compliant stops modelled at ±15°.</w:t>
-      </w:r>
-    </w:p>
-    <w:p>
-      <w:r>
-        <w:t>The optional four-channel EMG band measures forearm muscle activity. After calibration, it adds a small correction to the intended-motion estimate; it does not move the spoon or stimulate muscles. It is disabled by default and falls back to IMU-only control when its signal is invalid. Current EMG data are synthetic, not human recordings.</w:t>
+        <w:t>Safety and validation</w:t>
       </w:r>
     </w:p>
     <w:p>
@@ -496,22 +1187,22 @@
         <w:pStyle w:val="Heading2"/>
       </w:pPr>
       <w:r>
-        <w:t>What the simulation shows</w:t>
+        <w:t>Safety design to carry into the prototype</w:t>
       </w:r>
     </w:p>
     <w:p>
       <w:r>
-        <w:t>• Strong-tremor case: 4 Hz, 5° per axis and 8 mL of soup. Attitude vibration falls by about 92.6%; estimated spill is 2.73 mL without control and zero with control.</w:t>
+        <w:t>For water protection, seal the shell joints, buttons and charging port, and develop a flexible seal around the moving spoon connection. The seal must not restrict travel or add excessive friction. The detachable food-contact spoon should be cleaned separately; the powered handle should not be immersed. These are design intentions: no waterproof or IP rating has been verified.</w:t>
       </w:r>
     </w:p>
     <w:p>
       <w:r>
-        <w:t>• EMG comparison: in a separate voluntary-motion-plus-tremor trial, attitude RMS error falls from 0.498° to 0.418°, but peak current rises from 0.80 A to 1.33 A.</w:t>
+        <w:t>For electrical safety, insulate the battery, PCB and wiring from the metal spoon and moisture. Add battery overcharge, over-discharge and short-circuit protection, and prevent operation while charging. The EMG band should run from battery power while worn, without a wired charging connection. Low operating voltage does not establish acceptable leakage current; insulation, leakage and wet-condition fault tests are still required.</w:t>
       </w:r>
     </w:p>
     <w:p>
       <w:r>
-        <w:t>• These are specific test cases. The liquid model is simplified, and large or out-of-band tremor can exceed the mechanism’s limits. We cannot claim 100% suppression under every condition.</w:t>
+        <w:t>The chosen driver includes overcurrent and thermal protection, but whole-product safety also needs a tested response to sensor loss, jamming and low battery. Guard pinch points around the gimbal and verify loaded stops and flexures. These physical safety functions are not fully represented by the current simulation.</w:t>
       </w:r>
     </w:p>
     <w:p>
@@ -519,30 +1210,272 @@
         <w:pStyle w:val="Heading2"/>
       </w:pPr>
       <w:r>
-        <w:t>Safety</w:t>
+        <w:t>Results that can support the final report</w:t>
       </w:r>
     </w:p>
     <w:p>
       <w:r>
-        <w:t>For water protection, the plan is to seal the shell joints, buttons and charging port, and use a flexible seal around the moving spoon connection. The seal must not restrict gimbal travel. The detachable food-contact spoon should be washed separately; the powered handle should not be immersed. No waterproof or IP rating has been verified.</w:t>
+        <w:t>The comparisons use the same handle input on both sides. The uncontrolled baseline locks the spoon to the handle. Attitude-error RMS is measured against the intended orientation, with steady scoring from 1.5 s. Keep the test conditions attached to each reported result.</w:t>
+      </w:r>
+    </w:p>
+    <w:tbl>
+      <w:tblPr>
+        <w:tblW w:type="auto" w:w="0"/>
+        <w:jc w:val="center"/>
+        <w:tblLayout w:type="fixed"/>
+        <w:tblLook w:firstColumn="1" w:firstRow="1" w:lastColumn="0" w:lastRow="0" w:noHBand="0" w:noVBand="1" w:val="04A0"/>
+        <w:tblBorders>
+          <w:top w:val="single" w:sz="4" w:color="D9D9D9"/>
+          <w:left w:val="single" w:sz="4" w:color="D9D9D9"/>
+          <w:bottom w:val="single" w:sz="4" w:color="D9D9D9"/>
+          <w:right w:val="single" w:sz="4" w:color="D9D9D9"/>
+          <w:insideH w:val="single" w:sz="4" w:color="D9D9D9"/>
+          <w:insideV w:val="single" w:sz="4" w:color="D9D9D9"/>
+        </w:tblBorders>
+      </w:tblPr>
+      <w:tblGrid>
+        <w:gridCol w:w="2880"/>
+        <w:gridCol w:w="6696"/>
+      </w:tblGrid>
+      <w:tr>
+        <w:trPr>
+          <w:cantSplit/>
+          <w:tblHeader/>
+        </w:trPr>
+        <w:tc>
+          <w:tcPr>
+            <w:tcW w:type="dxa" w:w="2880"/>
+            <w:vAlign w:val="center"/>
+            <w:tcMar>
+              <w:top w:w="85" w:type="dxa"/>
+              <w:left w:w="85" w:type="dxa"/>
+              <w:bottom w:w="85" w:type="dxa"/>
+              <w:right w:w="85" w:type="dxa"/>
+            </w:tcMar>
+            <w:shd w:fill="343A40"/>
+          </w:tcPr>
+          <w:p>
+            <w:pPr>
+              <w:spacing w:after="20" w:line="247" w:lineRule="auto"/>
+            </w:pPr>
+            <w:r>
+              <w:rPr>
+                <w:b/>
+                <w:color w:val="FFFFFF"/>
+                <w:sz w:val="19"/>
+              </w:rPr>
+              <w:t>Native Simulink test</w:t>
+            </w:r>
+          </w:p>
+        </w:tc>
+        <w:tc>
+          <w:tcPr>
+            <w:tcW w:type="dxa" w:w="6696"/>
+            <w:vAlign w:val="center"/>
+            <w:tcMar>
+              <w:top w:w="85" w:type="dxa"/>
+              <w:left w:w="85" w:type="dxa"/>
+              <w:bottom w:w="85" w:type="dxa"/>
+              <w:right w:w="85" w:type="dxa"/>
+            </w:tcMar>
+            <w:shd w:fill="343A40"/>
+          </w:tcPr>
+          <w:p>
+            <w:pPr>
+              <w:spacing w:after="20" w:line="247" w:lineRule="auto"/>
+            </w:pPr>
+            <w:r>
+              <w:rPr>
+                <w:b/>
+                <w:color w:val="FFFFFF"/>
+                <w:sz w:val="19"/>
+              </w:rPr>
+              <w:t>Result and interpretation</w:t>
+            </w:r>
+          </w:p>
+        </w:tc>
+      </w:tr>
+      <w:tr>
+        <w:trPr>
+          <w:cantSplit/>
+        </w:trPr>
+        <w:tc>
+          <w:tcPr>
+            <w:tcW w:type="dxa" w:w="2880"/>
+            <w:vAlign w:val="center"/>
+            <w:tcMar>
+              <w:top w:w="85" w:type="dxa"/>
+              <w:left w:w="85" w:type="dxa"/>
+              <w:bottom w:w="85" w:type="dxa"/>
+              <w:right w:w="85" w:type="dxa"/>
+            </w:tcMar>
+            <w:shd w:fill="FFFFFF"/>
+          </w:tcPr>
+          <w:p>
+            <w:pPr>
+              <w:spacing w:after="20" w:line="247" w:lineRule="auto"/>
+            </w:pPr>
+            <w:r>
+              <w:rPr>
+                <w:b w:val="0"/>
+                <w:color w:val="000000"/>
+                <w:sz w:val="19"/>
+              </w:rPr>
+              <w:t>8 Hz, 1° per axis, 5 g, 2 s</w:t>
+            </w:r>
+          </w:p>
+        </w:tc>
+        <w:tc>
+          <w:tcPr>
+            <w:tcW w:type="dxa" w:w="6696"/>
+            <w:vAlign w:val="center"/>
+            <w:tcMar>
+              <w:top w:w="85" w:type="dxa"/>
+              <w:left w:w="85" w:type="dxa"/>
+              <w:bottom w:w="85" w:type="dxa"/>
+              <w:right w:w="85" w:type="dxa"/>
+            </w:tcMar>
+            <w:shd w:fill="FFFFFF"/>
+          </w:tcPr>
+          <w:p>
+            <w:pPr>
+              <w:spacing w:after="20" w:line="247" w:lineRule="auto"/>
+            </w:pPr>
+            <w:r>
+              <w:rPr>
+                <w:b w:val="0"/>
+                <w:color w:val="000000"/>
+                <w:sz w:val="19"/>
+              </w:rPr>
+              <w:t>96.61% attitude reduction; 0.0339° RMS. Evidence for this nominal case, not universal performance.</w:t>
+            </w:r>
+          </w:p>
+        </w:tc>
+      </w:tr>
+      <w:tr>
+        <w:trPr>
+          <w:cantSplit/>
+        </w:trPr>
+        <w:tc>
+          <w:tcPr>
+            <w:tcW w:type="dxa" w:w="2880"/>
+            <w:vAlign w:val="center"/>
+            <w:tcMar>
+              <w:top w:w="85" w:type="dxa"/>
+              <w:left w:w="85" w:type="dxa"/>
+              <w:bottom w:w="85" w:type="dxa"/>
+              <w:right w:w="85" w:type="dxa"/>
+            </w:tcMar>
+            <w:shd w:fill="F2F4F6"/>
+          </w:tcPr>
+          <w:p>
+            <w:pPr>
+              <w:spacing w:after="20" w:line="247" w:lineRule="auto"/>
+            </w:pPr>
+            <w:r>
+              <w:rPr>
+                <w:b w:val="0"/>
+                <w:color w:val="000000"/>
+                <w:sz w:val="19"/>
+              </w:rPr>
+              <w:t>4 Hz, 5° per axis, 8 mL, 4 s</w:t>
+            </w:r>
+          </w:p>
+        </w:tc>
+        <w:tc>
+          <w:tcPr>
+            <w:tcW w:type="dxa" w:w="6696"/>
+            <w:vAlign w:val="center"/>
+            <w:tcMar>
+              <w:top w:w="85" w:type="dxa"/>
+              <w:left w:w="85" w:type="dxa"/>
+              <w:bottom w:w="85" w:type="dxa"/>
+              <w:right w:w="85" w:type="dxa"/>
+            </w:tcMar>
+            <w:shd w:fill="F2F4F6"/>
+          </w:tcPr>
+          <w:p>
+            <w:pPr>
+              <w:spacing w:after="20" w:line="247" w:lineRule="auto"/>
+            </w:pPr>
+            <w:r>
+              <w:rPr>
+                <w:b w:val="0"/>
+                <w:color w:val="000000"/>
+                <w:sz w:val="19"/>
+              </w:rPr>
+              <w:t>92.58% attitude reduction. Estimated spill: 2.728 mL without control and zero with control. Spoon-position RMS still 4.06 mm.</w:t>
+            </w:r>
+          </w:p>
+        </w:tc>
+      </w:tr>
+      <w:tr>
+        <w:trPr>
+          <w:cantSplit/>
+        </w:trPr>
+        <w:tc>
+          <w:tcPr>
+            <w:tcW w:type="dxa" w:w="2880"/>
+            <w:vAlign w:val="center"/>
+            <w:tcMar>
+              <w:top w:w="85" w:type="dxa"/>
+              <w:left w:w="85" w:type="dxa"/>
+              <w:bottom w:w="85" w:type="dxa"/>
+              <w:right w:w="85" w:type="dxa"/>
+            </w:tcMar>
+            <w:shd w:fill="FFFFFF"/>
+          </w:tcPr>
+          <w:p>
+            <w:pPr>
+              <w:spacing w:after="20" w:line="247" w:lineRule="auto"/>
+            </w:pPr>
+            <w:r>
+              <w:rPr>
+                <w:b w:val="0"/>
+                <w:color w:val="000000"/>
+                <w:sz w:val="19"/>
+              </w:rPr>
+              <w:t>Voluntary motion plus 8 Hz tremor, 4 s</w:t>
+            </w:r>
+          </w:p>
+        </w:tc>
+        <w:tc>
+          <w:tcPr>
+            <w:tcW w:type="dxa" w:w="6696"/>
+            <w:vAlign w:val="center"/>
+            <w:tcMar>
+              <w:top w:w="85" w:type="dxa"/>
+              <w:left w:w="85" w:type="dxa"/>
+              <w:bottom w:w="85" w:type="dxa"/>
+              <w:right w:w="85" w:type="dxa"/>
+            </w:tcMar>
+            <w:shd w:fill="FFFFFF"/>
+          </w:tcPr>
+          <w:p>
+            <w:pPr>
+              <w:spacing w:after="20" w:line="247" w:lineRule="auto"/>
+            </w:pPr>
+            <w:r>
+              <w:rPr>
+                <w:b w:val="0"/>
+                <w:color w:val="000000"/>
+                <w:sz w:val="19"/>
+              </w:rPr>
+              <w:t>Synthetic EMG reduces RMS from 0.498° to 0.418°; peak current rises from 0.80 A to 1.33 A. Better tracking has an actuator cost.</w:t>
+            </w:r>
+          </w:p>
+        </w:tc>
+      </w:tr>
+    </w:tbl>
+    <w:p/>
+    <w:p>
+      <w:r>
+        <w:t>Twelve verification groups pass, covering the implemented geometry, dynamics, sensors, control, fluid and EMG interfaces. Separate fast-integrator boundary tests fail under 20 Hz or large stepped disturbances. Passing implementation checks does not mean every disturbance is controlled successfully.</w:t>
       </w:r>
     </w:p>
     <w:p>
       <w:r>
-        <w:t>For electrical safety, the plan is to insulate the battery, PCB and wiring from the metal spoon and moisture, add battery overcharge, over-discharge and short-circuit protection, and stop operation during charging. Low battery voltage does not mean zero leakage-current or short-circuit risk. The EMG band should operate from battery power while worn, without a wired charging connection. Leakage current, insulation and wet-condition faults still need testing.</w:t>
-      </w:r>
-    </w:p>
-    <w:p>
-      <w:r>
-        <w:t>The selected driver includes overcurrent and thermal protection, but those features do not prove the whole product is safe. We also need guarded pinch points and a tested response to sensor loss or jamming. These are prototype requirements, not completed safety features.</w:t>
-      </w:r>
-    </w:p>
-    <w:p>
-      <w:pPr>
-        <w:pStyle w:val="Caption"/>
-      </w:pPr>
-      <w:r>
-        <w:t>Driver protection details: https://www.ti.com/product/DRV8876</w:t>
+        <w:t>The liquid model uses simplified slosh and overflow driven by the solved spoon motion. Fluid reaction forces and changing payload after a spill do not feed back into the mechanism. Grid refinement changes uncontrolled spill from 2.728 to 2.682 mL in the strong case. This supports numerical consistency, not a guarantee that real soup will never spill.</w:t>
       </w:r>
     </w:p>
     <w:p>
@@ -550,16 +1483,12 @@
         <w:pStyle w:val="Heading2"/>
       </w:pPr>
       <w:r>
-        <w:t>Next team tasks</w:t>
+        <w:t>Next work and source files</w:t>
       </w:r>
     </w:p>
     <w:p>
       <w:r>
-        <w:t>• Finalise rod ends, shaft-extension stiffness, clearances and the quick-release connection.</w:t>
-        <w:br/>
-        <w:t>• Finish PCB routing, sealing and charging/protection circuitry.</w:t>
-        <w:br/>
-        <w:t>• Test the physical mechanism and real EMG, then check grip comfort and cleaning.</w:t>
+        <w:t>Priorities are rod-end and extension validation, PCB and protection circuitry, sealing, bench identification and real EMG testing. Use docs/HARDWARE_BOM.md for manufacturer links and assumptions; docs/CONTROL.md, docs/LIQUID_MODEL.md and docs/EMG_WRISTBAND.md for methods. Detailed results are in output/results/CONTROL_RESULTS.md and emg_comparison.csv. These are the source records to check when writing the final report.</w:t>
       </w:r>
     </w:p>
     <w:sectPr>
@@ -956,12 +1885,12 @@
     <w:rsid w:val="00FC693F"/>
     <w:pPr>
       <w:widowControl/>
-      <w:spacing w:after="120" w:line="254" w:lineRule="auto"/>
+      <w:spacing w:after="120" w:line="259" w:lineRule="auto"/>
     </w:pPr>
     <w:rPr>
       <w:rFonts w:ascii="Calibri" w:hAnsi="Calibri"/>
       <w:color w:val="000000"/>
-      <w:sz w:val="22"/>
+      <w:sz w:val="21"/>
     </w:rPr>
   </w:style>
   <w:style w:type="paragraph" w:styleId="Header">

</xml_diff>